<commit_message>
Update compliance report and WhatsApp requirements docs for CEO
</commit_message>
<xml_diff>
--- a/EAC_Compliance_Report.docx
+++ b/EAC_Compliance_Report.docx
@@ -12,12 +12,12 @@
     </w:p>
     <w:p>
       <w:r>
-        <w:t>Date: 20 March 2026</w:t>
+        <w:t>Date: 25 March 2026</w:t>
       </w:r>
     </w:p>
     <w:p>
       <w:r>
-        <w:t>Prepared by: Development Team</w:t>
+        <w:t>Prepared by: Development Team (TripleAI Consultants)</w:t>
       </w:r>
     </w:p>
     <w:p/>
@@ -31,7 +31,7 @@
     </w:p>
     <w:p>
       <w:r>
-        <w:t>This document summarises all compliance and performance changes implemented on the E.A.C. Insurance website following a pre-launch audit. The audit identified critical blockers across GDPR/ePrivacy, IDD (Insurance Distribution Directive), AI Act transparency, accessibility (WCAG), and Core Web Vitals performance. All identified issues have been addressed except for three regulatory placeholders that require CEO input.</w:t>
+        <w:t>This document summarises all compliance, security, and performance changes implemented on the E.A.C. Insurance website following a pre-launch audit. The audit identified critical blockers across GDPR/ePrivacy, IDD (Insurance Distribution Directive), AI Act transparency, accessibility (WCAG), Core Web Vitals performance, and website security. All identified issues have been addressed except for three regulatory placeholders that require CEO input.</w:t>
       </w:r>
     </w:p>
     <w:p>
@@ -47,12 +47,12 @@
         <w:pStyle w:val="Heading2"/>
       </w:pPr>
       <w:r>
-        <w:t>2.1 Legal Pages (6 new files)</w:t>
+        <w:t>2.1 Legal Pages (8 new files)</w:t>
       </w:r>
     </w:p>
     <w:p>
       <w:r>
-        <w:t>Three new legal pages were created in both English and Greek:</w:t>
+        <w:t>Four legal pages were created in both English and Greek:</w:t>
       </w:r>
     </w:p>
     <w:p>
@@ -60,7 +60,7 @@
         <w:rPr>
           <w:b/>
         </w:rPr>
-        <w:t xml:space="preserve">privacy-policy.html + EL/privacy-policy.html: </w:t>
+        <w:t xml:space="preserve">Privacy Policy (privacy-policy.html + EL/privacy-policy.html): </w:t>
       </w:r>
       <w:r>
         <w:t>Full GDPR-compliant privacy policy. Includes: data controller details, data collected (contact form, technical logs, cookies), processing purposes, legal bases (consent, pre-contractual measures, legitimate interest), data recipients, retention periods (24 months for inquiries, 36 months for marketing inactivity), data subject rights (access, rectification, erasure, restriction, portability, complaint), chatbot disclosure, and WhatsApp sensitive data warning.</w:t>
@@ -71,7 +71,7 @@
         <w:rPr>
           <w:b/>
         </w:rPr>
-        <w:t xml:space="preserve">cookie-policy.html + EL/cookie-policy.html: </w:t>
+        <w:t xml:space="preserve">Cookie Policy (cookie-policy.html + EL/cookie-policy.html): </w:t>
       </w:r>
       <w:r>
         <w:t>Cookie categories table (Strictly Necessary, Preferences, Analytics, Marketing) plus a detailed cookie list table documenting all storage items: cmp_consent, popupLastShown, popupMinimized, theme, and Botpress (bp:*) cookies. Links to Cookie Settings modal via CMP.</w:t>
@@ -82,10 +82,21 @@
         <w:rPr>
           <w:b/>
         </w:rPr>
-        <w:t xml:space="preserve">disclosures.html + EL/disclosures.html: </w:t>
+        <w:t xml:space="preserve">Disclosures / IIID (disclosures.html + EL/disclosures.html): </w:t>
       </w:r>
       <w:r>
-        <w:t>Insurance Intermediary Information Document (IIID) per IDD directive. Includes company details, status, registration, advice disclosure, remuneration types, complaints procedure, and disclaimer. Contains three placeholders requiring CEO input (see Section 4).</w:t>
+        <w:t>Insurance Intermediary Information Document (IIID) per IDD directive. Includes company details, status, registration, advice disclosure, remuneration types, complaints procedure, and disclaimer. Contains three placeholders requiring CEO input (see Section 5).</w:t>
+      </w:r>
+    </w:p>
+    <w:p>
+      <w:r>
+        <w:rPr>
+          <w:b/>
+        </w:rPr>
+        <w:t xml:space="preserve">Terms &amp; Conditions (terms.html + EL/terms.html): </w:t>
+      </w:r>
+      <w:r>
+        <w:t>Covers: acceptance of terms, non-binding quotes disclaimer (all quotes subject to underwriting), insurance intermediary role clarification, accuracy of information disclaimer, user responsibilities, AI chatbot disclaimer, third-party links, intellectual property, limitation of liability, formal complaints procedure (5-day acknowledgement, 30-day response, ICCS escalation), governing law (Republic of Cyprus), and changes to terms.</w:t>
       </w:r>
     </w:p>
     <w:p>
@@ -98,7 +109,7 @@
     </w:p>
     <w:p>
       <w:r>
-        <w:t>Created assets/js/cmp.js — a self-contained, bilingual cookie consent banner. The script auto-detects the page language by checking if the URL path contains /EL/. Features:</w:t>
+        <w:t>Created a self-contained, bilingual cookie consent banner (assets/js/cmp.js). The script auto-detects the page language by checking if the URL path contains /EL/. Features:</w:t>
       </w:r>
     </w:p>
     <w:p>
@@ -130,7 +141,7 @@
         <w:pStyle w:val="ListBullet"/>
       </w:pPr>
       <w:r>
-        <w:t>Exposes window.CMP.openSettings() API for the footer Cookie Settings link</w:t>
+        <w:t>Footer "Cookie Settings" link opens the CMP modal on every page</w:t>
       </w:r>
     </w:p>
     <w:p>
@@ -138,15 +149,7 @@
         <w:pStyle w:val="ListBullet"/>
       </w:pPr>
       <w:r>
-        <w:t>Fires cmp:consent-updated custom event for future integration</w:t>
-      </w:r>
-    </w:p>
-    <w:p>
-      <w:pPr>
-        <w:pStyle w:val="ListBullet"/>
-      </w:pPr>
-      <w:r>
-        <w:t>Added to all 16 pages (10 existing + 6 new legal pages)</w:t>
+        <w:t>Added to all 18 pages (10 existing + 8 new legal pages)</w:t>
       </w:r>
     </w:p>
     <w:p>
@@ -159,23 +162,15 @@
     </w:p>
     <w:p>
       <w:pPr>
-        <w:pStyle w:val="ListBullet"/>
-      </w:pPr>
-      <w:r>
-        <w:t>Z-index 200000 ensures it stacks above all existing elements including the popup widget</w:t>
-      </w:r>
-    </w:p>
-    <w:p>
-      <w:pPr>
         <w:pStyle w:val="Heading2"/>
       </w:pPr>
       <w:r>
-        <w:t>2.3 Server-Side Consent Logging</w:t>
+        <w:t>2.3 Server-Side Consent Logging (Cloudflare Worker)</w:t>
       </w:r>
     </w:p>
     <w:p>
       <w:r>
-        <w:t>For GDPR proof-of-consent, a Cloudflare Worker was created and deployed:</w:t>
+        <w:t>For GDPR proof-of-consent, a Cloudflare Worker was deployed:</w:t>
       </w:r>
     </w:p>
     <w:p>
@@ -191,7 +186,7 @@
         <w:pStyle w:val="ListBullet"/>
       </w:pPr>
       <w:r>
-        <w:t>Receives POST requests from the CMP with consent data</w:t>
+        <w:t>Receives consent data automatically when a visitor makes a cookie choice</w:t>
       </w:r>
     </w:p>
     <w:p>
@@ -199,7 +194,7 @@
         <w:pStyle w:val="ListBullet"/>
       </w:pPr>
       <w:r>
-        <w:t>Validates required fields (consent_id, choices)</w:t>
+        <w:t>Stores records in Cloudflare KV with automatic 3-year expiry</w:t>
       </w:r>
     </w:p>
     <w:p>
@@ -207,7 +202,7 @@
         <w:pStyle w:val="ListBullet"/>
       </w:pPr>
       <w:r>
-        <w:t>Adds server-side metadata: server timestamp and visitor country (via Cloudflare)</w:t>
+        <w:t>Adds server-side metadata: server timestamp and visitor country</w:t>
       </w:r>
     </w:p>
     <w:p>
@@ -215,7 +210,331 @@
         <w:pStyle w:val="ListBullet"/>
       </w:pPr>
       <w:r>
-        <w:t>Stores records in Cloudflare KV with 3-year TTL (auto-expiry)</w:t>
+        <w:t>Free tier: 100,000 requests/day — more than sufficient</w:t>
+      </w:r>
+    </w:p>
+    <w:p>
+      <w:pPr>
+        <w:pStyle w:val="Heading2"/>
+      </w:pPr>
+      <w:r>
+        <w:t>2.4 IDD Text Compliance (Misleading Claims Removed)</w:t>
+      </w:r>
+    </w:p>
+    <w:p>
+      <w:r>
+        <w:t>Per IDD non-misleading requirements, the following text was changed across all pages (English + Greek):</w:t>
+      </w:r>
+    </w:p>
+    <w:tbl>
+      <w:tblPr>
+        <w:tblStyle w:val="TableGrid"/>
+        <w:tblW w:type="auto" w:w="0"/>
+        <w:tblLook w:firstColumn="1" w:firstRow="1" w:lastColumn="0" w:lastRow="0" w:noHBand="0" w:noVBand="1" w:val="04A0"/>
+      </w:tblPr>
+      <w:tblGrid>
+        <w:gridCol w:w="4320"/>
+        <w:gridCol w:w="4320"/>
+      </w:tblGrid>
+      <w:tr>
+        <w:tc>
+          <w:tcPr>
+            <w:tcW w:type="dxa" w:w="4320"/>
+          </w:tcPr>
+          <w:p>
+            <w:r>
+              <w:rPr>
+                <w:b/>
+              </w:rPr>
+              <w:t>Before</w:t>
+            </w:r>
+          </w:p>
+        </w:tc>
+        <w:tc>
+          <w:tcPr>
+            <w:tcW w:type="dxa" w:w="4320"/>
+          </w:tcPr>
+          <w:p>
+            <w:r>
+              <w:rPr>
+                <w:b/>
+              </w:rPr>
+              <w:t>After</w:t>
+            </w:r>
+          </w:p>
+        </w:tc>
+      </w:tr>
+      <w:tr>
+        <w:tc>
+          <w:tcPr>
+            <w:tcW w:type="dxa" w:w="4320"/>
+          </w:tcPr>
+          <w:p>
+            <w:r>
+              <w:t>"Clarity and Coverage, Guaranteed"</w:t>
+            </w:r>
+          </w:p>
+        </w:tc>
+        <w:tc>
+          <w:tcPr>
+            <w:tcW w:type="dxa" w:w="4320"/>
+          </w:tcPr>
+          <w:p>
+            <w:r>
+              <w:t>"Clarity and Coverage, Delivered"</w:t>
+            </w:r>
+          </w:p>
+        </w:tc>
+      </w:tr>
+      <w:tr>
+        <w:tc>
+          <w:tcPr>
+            <w:tcW w:type="dxa" w:w="4320"/>
+          </w:tcPr>
+          <w:p>
+            <w:r>
+              <w:t>"98% Claims Success Rate"</w:t>
+            </w:r>
+          </w:p>
+        </w:tc>
+        <w:tc>
+          <w:tcPr>
+            <w:tcW w:type="dxa" w:w="4320"/>
+          </w:tcPr>
+          <w:p>
+            <w:r>
+              <w:t>"98% Claims Satisfaction"</w:t>
+            </w:r>
+          </w:p>
+        </w:tc>
+      </w:tr>
+      <w:tr>
+        <w:tc>
+          <w:tcPr>
+            <w:tcW w:type="dxa" w:w="4320"/>
+          </w:tcPr>
+          <w:p>
+            <w:r>
+              <w:t>"10 Minute Response Time"</w:t>
+            </w:r>
+          </w:p>
+        </w:tc>
+        <w:tc>
+          <w:tcPr>
+            <w:tcW w:type="dxa" w:w="4320"/>
+          </w:tcPr>
+          <w:p>
+            <w:r>
+              <w:t>"15 Years of Experience"</w:t>
+            </w:r>
+          </w:p>
+        </w:tc>
+      </w:tr>
+      <w:tr>
+        <w:tc>
+          <w:tcPr>
+            <w:tcW w:type="dxa" w:w="4320"/>
+          </w:tcPr>
+          <w:p>
+            <w:r>
+              <w:t>"Save 25-40%"</w:t>
+            </w:r>
+          </w:p>
+        </w:tc>
+        <w:tc>
+          <w:tcPr>
+            <w:tcW w:type="dxa" w:w="4320"/>
+          </w:tcPr>
+          <w:p>
+            <w:r>
+              <w:t>"Potential savings"</w:t>
+            </w:r>
+          </w:p>
+        </w:tc>
+      </w:tr>
+      <w:tr>
+        <w:tc>
+          <w:tcPr>
+            <w:tcW w:type="dxa" w:w="4320"/>
+          </w:tcPr>
+          <w:p>
+            <w:r>
+              <w:t>"Up to 30% discount for families"</w:t>
+            </w:r>
+          </w:p>
+        </w:tc>
+        <w:tc>
+          <w:tcPr>
+            <w:tcW w:type="dxa" w:w="4320"/>
+          </w:tcPr>
+          <w:p>
+            <w:r>
+              <w:t>"Family discounts available on eligible plans"</w:t>
+            </w:r>
+          </w:p>
+        </w:tc>
+      </w:tr>
+      <w:tr>
+        <w:tc>
+          <w:tcPr>
+            <w:tcW w:type="dxa" w:w="4320"/>
+          </w:tcPr>
+          <w:p>
+            <w:r>
+              <w:t>"10-20% discount with security systems"</w:t>
+            </w:r>
+          </w:p>
+        </w:tc>
+        <w:tc>
+          <w:tcPr>
+            <w:tcW w:type="dxa" w:w="4320"/>
+          </w:tcPr>
+          <w:p>
+            <w:r>
+              <w:t>"Discounts may apply for security systems"</w:t>
+            </w:r>
+          </w:p>
+        </w:tc>
+      </w:tr>
+      <w:tr>
+        <w:tc>
+          <w:tcPr>
+            <w:tcW w:type="dxa" w:w="4320"/>
+          </w:tcPr>
+          <w:p>
+            <w:r>
+              <w:t>"best discounts / best protection"</w:t>
+            </w:r>
+          </w:p>
+        </w:tc>
+        <w:tc>
+          <w:tcPr>
+            <w:tcW w:type="dxa" w:w="4320"/>
+          </w:tcPr>
+          <w:p>
+            <w:r>
+              <w:t>"competitive discounts / right protection"</w:t>
+            </w:r>
+          </w:p>
+        </w:tc>
+      </w:tr>
+      <w:tr>
+        <w:tc>
+          <w:tcPr>
+            <w:tcW w:type="dxa" w:w="4320"/>
+          </w:tcPr>
+          <w:p>
+            <w:r>
+              <w:t>"no hidden fees or surprises"</w:t>
+            </w:r>
+          </w:p>
+        </w:tc>
+        <w:tc>
+          <w:tcPr>
+            <w:tcW w:type="dxa" w:w="4320"/>
+          </w:tcPr>
+          <w:p>
+            <w:r>
+              <w:t>"clear terms and pricing upfront"</w:t>
+            </w:r>
+          </w:p>
+        </w:tc>
+      </w:tr>
+      <w:tr>
+        <w:tc>
+          <w:tcPr>
+            <w:tcW w:type="dxa" w:w="4320"/>
+          </w:tcPr>
+          <w:p>
+            <w:r>
+              <w:t>"free preventive check-ups"</w:t>
+            </w:r>
+          </w:p>
+        </w:tc>
+        <w:tc>
+          <w:tcPr>
+            <w:tcW w:type="dxa" w:w="4320"/>
+          </w:tcPr>
+          <w:p>
+            <w:r>
+              <w:t>"preventive check-ups"</w:t>
+            </w:r>
+          </w:p>
+        </w:tc>
+      </w:tr>
+      <w:tr>
+        <w:tc>
+          <w:tcPr>
+            <w:tcW w:type="dxa" w:w="4320"/>
+          </w:tcPr>
+          <w:p>
+            <w:r>
+              <w:t>"Free Advice" (popup widget)</w:t>
+            </w:r>
+          </w:p>
+        </w:tc>
+        <w:tc>
+          <w:tcPr>
+            <w:tcW w:type="dxa" w:w="4320"/>
+          </w:tcPr>
+          <w:p>
+            <w:r>
+              <w:t>"Get a Quote" / "Ζητήστε Προσφορά"</w:t>
+            </w:r>
+          </w:p>
+        </w:tc>
+      </w:tr>
+      <w:tr>
+        <w:tc>
+          <w:tcPr>
+            <w:tcW w:type="dxa" w:w="4320"/>
+          </w:tcPr>
+          <w:p>
+            <w:r>
+              <w:t>"within 10 minutes" / "within 48 hours"</w:t>
+            </w:r>
+          </w:p>
+        </w:tc>
+        <w:tc>
+          <w:tcPr>
+            <w:tcW w:type="dxa" w:w="4320"/>
+          </w:tcPr>
+          <w:p>
+            <w:r>
+              <w:t>"as quickly as possible" / "promptly"</w:t>
+            </w:r>
+          </w:p>
+        </w:tc>
+      </w:tr>
+      <w:tr>
+        <w:tc>
+          <w:tcPr>
+            <w:tcW w:type="dxa" w:w="4320"/>
+          </w:tcPr>
+          <w:p>
+            <w:r>
+              <w:t>"not empty promises"</w:t>
+            </w:r>
+          </w:p>
+        </w:tc>
+        <w:tc>
+          <w:tcPr>
+            <w:tcW w:type="dxa" w:w="4320"/>
+          </w:tcPr>
+          <w:p>
+            <w:r>
+              <w:t>"that fits your needs" / "tailored to your needs"</w:t>
+            </w:r>
+          </w:p>
+        </w:tc>
+      </w:tr>
+    </w:tbl>
+    <w:p>
+      <w:pPr>
+        <w:pStyle w:val="Heading2"/>
+      </w:pPr>
+      <w:r>
+        <w:t>2.5 Footer Updates (all 18 pages)</w:t>
       </w:r>
     </w:p>
     <w:p>
@@ -223,44 +542,7 @@
         <w:pStyle w:val="ListBullet"/>
       </w:pPr>
       <w:r>
-        <w:t>Handles CORS for cross-origin requests from any domain</w:t>
-      </w:r>
-    </w:p>
-    <w:p>
-      <w:pPr>
-        <w:pStyle w:val="ListBullet"/>
-      </w:pPr>
-      <w:r>
-        <w:t>Files: consent-worker/worker.js and consent-worker/wrangler.toml</w:t>
-      </w:r>
-    </w:p>
-    <w:p>
-      <w:pPr>
-        <w:pStyle w:val="ListBullet"/>
-      </w:pPr>
-      <w:r>
-        <w:t>KV Namespace ID: a7396e2b455f4a509a830d9668e4b9d4</w:t>
-      </w:r>
-    </w:p>
-    <w:p>
-      <w:pPr>
-        <w:pStyle w:val="Heading2"/>
-      </w:pPr>
-      <w:r>
-        <w:t>2.4 Footer Updates (all 16 pages)</w:t>
-      </w:r>
-    </w:p>
-    <w:p>
-      <w:r>
-        <w:t>Two additions made to every page footer:</w:t>
-      </w:r>
-    </w:p>
-    <w:p>
-      <w:pPr>
-        <w:pStyle w:val="ListBullet"/>
-      </w:pPr>
-      <w:r>
-        <w:t>Legal links row: Privacy Policy | Cookie Policy | Disclosures | Cookie Settings (wired to CMP modal)</w:t>
+        <w:t>Legal links row: Privacy Policy | Cookie Policy | Disclosures | Terms &amp; Conditions | Cookie Settings</w:t>
       </w:r>
     </w:p>
     <w:p>
@@ -276,63 +558,6 @@
         <w:pStyle w:val="Heading2"/>
       </w:pPr>
       <w:r>
-        <w:t>2.5 Misleading Claims Text Removed (all 10 existing pages)</w:t>
-      </w:r>
-    </w:p>
-    <w:p>
-      <w:r>
-        <w:t>Per IDD non-misleading requirements, all specific time promises were removed:</w:t>
-      </w:r>
-    </w:p>
-    <w:p>
-      <w:r>
-        <w:rPr>
-          <w:b/>
-        </w:rPr>
-        <w:t xml:space="preserve">FAQ section (all pages): </w:t>
-      </w:r>
-      <w:r>
-        <w:t>"Claims processed within 15 minutes" → "We begin processing your claim right away — resolution time depends on the insurer and documentation required."</w:t>
-      </w:r>
-    </w:p>
-    <w:p>
-      <w:r>
-        <w:rPr>
-          <w:b/>
-        </w:rPr>
-        <w:t xml:space="preserve">Testimonial (all pages): </w:t>
-      </w:r>
-      <w:r>
-        <w:t>"handled my claim within 15 minutes as promised" → "started handling my claim immediately. Professional, thorough, and always available."</w:t>
-      </w:r>
-    </w:p>
-    <w:p>
-      <w:r>
-        <w:rPr>
-          <w:b/>
-        </w:rPr>
-        <w:t xml:space="preserve">Motor/Health pages: </w:t>
-      </w:r>
-      <w:r>
-        <w:t>"claims processed within 48 hours" → "claims processed promptly"</w:t>
-      </w:r>
-    </w:p>
-    <w:p>
-      <w:r>
-        <w:rPr>
-          <w:b/>
-        </w:rPr>
-        <w:t xml:space="preserve">Home page: </w:t>
-      </w:r>
-      <w:r>
-        <w:t>"Fast 24-48 hour claim processing" → "Fast claim processing"</w:t>
-      </w:r>
-    </w:p>
-    <w:p>
-      <w:pPr>
-        <w:pStyle w:val="Heading2"/>
-      </w:pPr>
-      <w:r>
         <w:t>2.6 Video Performance (main.html + EL/main.html)</w:t>
       </w:r>
     </w:p>
@@ -341,7 +566,7 @@
         <w:pStyle w:val="ListBullet"/>
       </w:pPr>
       <w:r>
-        <w:t>Changed preload="auto" to preload="none" — prevents auto-downloading the full video on page load</w:t>
+        <w:t>Changed preload="auto" to preload="none" — prevents auto-downloading the full video</w:t>
       </w:r>
     </w:p>
     <w:p>
@@ -349,7 +574,15 @@
         <w:pStyle w:val="ListBullet"/>
       </w:pPr>
       <w:r>
-        <w:t>Generated video_poster.jpg from actual video frame (frame 30, 1280×720, JPEG quality 85) using OpenCV</w:t>
+        <w:t>Generated poster image from actual video frame for immediate visual content</w:t>
+      </w:r>
+    </w:p>
+    <w:p>
+      <w:pPr>
+        <w:pStyle w:val="Heading2"/>
+      </w:pPr>
+      <w:r>
+        <w:t>2.7 Accessibility — Reduced Motion</w:t>
       </w:r>
     </w:p>
     <w:p>
@@ -357,7 +590,15 @@
         <w:pStyle w:val="ListBullet"/>
       </w:pPr>
       <w:r>
-        <w:t>Added poster attribute to the video element for immediate visual content before video loads</w:t>
+        <w:t>CSS: prefers-reduced-motion media query disables all animations for users who enable "Reduce motion" in OS settings</w:t>
+      </w:r>
+    </w:p>
+    <w:p>
+      <w:pPr>
+        <w:pStyle w:val="ListBullet"/>
+      </w:pPr>
+      <w:r>
+        <w:t>JavaScript: Auto-pauses the hero video for reduced-motion users</w:t>
       </w:r>
     </w:p>
     <w:p>
@@ -365,12 +606,7 @@
         <w:pStyle w:val="Heading2"/>
       </w:pPr>
       <w:r>
-        <w:t>2.7 Accessibility — Reduced Motion (all pages)</w:t>
-      </w:r>
-    </w:p>
-    <w:p>
-      <w:r>
-        <w:t>Two layers of reduced motion support added:</w:t>
+        <w:t>2.8 Security Fixes</w:t>
       </w:r>
     </w:p>
     <w:p>
@@ -378,7 +614,7 @@
         <w:pStyle w:val="ListBullet"/>
       </w:pPr>
       <w:r>
-        <w:t>CSS: prefers-reduced-motion media query in both main.css and sub.css. Disables all CSS animations, transitions, AOS scroll effects, and Swiper autoplay for users who enable "Reduce motion" in their OS settings.</w:t>
+        <w:t>XSS fix: Form error messages now use textContent instead of innerHTML (prevents code injection)</w:t>
       </w:r>
     </w:p>
     <w:p>
@@ -386,7 +622,23 @@
         <w:pStyle w:val="ListBullet"/>
       </w:pPr>
       <w:r>
-        <w:t>JavaScript: Auto-pauses the hero video and removes autoplay attribute for reduced-motion users (main.html + EL/main.html).</w:t>
+        <w:t>Security headers: X-Content-Type-Options (nosniff) and Referrer-Policy added to all 18 pages</w:t>
+      </w:r>
+    </w:p>
+    <w:p>
+      <w:pPr>
+        <w:pStyle w:val="ListBullet"/>
+      </w:pPr>
+      <w:r>
+        <w:t>Cookie code color: Fixed for visibility in both light and dark mode</w:t>
+      </w:r>
+    </w:p>
+    <w:p>
+      <w:pPr>
+        <w:pStyle w:val="ListBullet"/>
+      </w:pPr>
+      <w:r>
+        <w:t>Image alt text: Corrected wrong alt attributes on health, home, and business pages</w:t>
       </w:r>
     </w:p>
     <w:p>
@@ -394,25 +646,7 @@
         <w:pStyle w:val="Heading2"/>
       </w:pPr>
       <w:r>
-        <w:t>2.8 EL Language Parity</w:t>
-      </w:r>
-    </w:p>
-    <w:p>
-      <w:r>
-        <w:t>Fixed duplicate heading bug in EL/main.html (removed extra "Ασφάλιση ΜΜΕ" heading). All Greek pages mirror English changes with proper translations.</w:t>
-      </w:r>
-    </w:p>
-    <w:p>
-      <w:pPr>
-        <w:pStyle w:val="Heading2"/>
-      </w:pPr>
-      <w:r>
-        <w:t>2.9 CSS Additions</w:t>
-      </w:r>
-    </w:p>
-    <w:p>
-      <w:r>
-        <w:t>All new styles added to both main.css and sub.css:</w:t>
+        <w:t>2.9 SEO &amp; Technical Files</w:t>
       </w:r>
     </w:p>
     <w:p>
@@ -420,7 +654,7 @@
         <w:pStyle w:val="ListBullet"/>
       </w:pPr>
       <w:r>
-        <w:t>CMP banner and modal styles (using CSS variables for automatic dark mode support)</w:t>
+        <w:t>robots.txt — Blocks /forms/ and /consent-worker/ from search engines</w:t>
       </w:r>
     </w:p>
     <w:p>
@@ -428,31 +662,7 @@
         <w:pStyle w:val="ListBullet"/>
       </w:pPr>
       <w:r>
-        <w:t>Footer legal links row styling</w:t>
-      </w:r>
-    </w:p>
-    <w:p>
-      <w:pPr>
-        <w:pStyle w:val="ListBullet"/>
-      </w:pPr>
-      <w:r>
-        <w:t>Legal page content formatting (headings, paragraphs, tables, lists)</w:t>
-      </w:r>
-    </w:p>
-    <w:p>
-      <w:pPr>
-        <w:pStyle w:val="ListBullet"/>
-      </w:pPr>
-      <w:r>
-        <w:t>prefers-reduced-motion media query</w:t>
-      </w:r>
-    </w:p>
-    <w:p>
-      <w:pPr>
-        <w:pStyle w:val="ListBullet"/>
-      </w:pPr>
-      <w:r>
-        <w:t>Code element colour override for cookie list table</w:t>
+        <w:t>sitemap.xml — Lists all 18 pages for search engine indexing</w:t>
       </w:r>
     </w:p>
     <w:p>
@@ -465,7 +675,7 @@
     </w:p>
     <w:p>
       <w:r>
-        <w:t>All changes were made with zero impact on existing functionality. Key principles:</w:t>
+        <w:t>All changes were made with zero impact on existing functionality:</w:t>
       </w:r>
     </w:p>
     <w:p>
@@ -473,7 +683,7 @@
         <w:pStyle w:val="ListBullet"/>
       </w:pPr>
       <w:r>
-        <w:t>New legal pages use the same HTML shell (head/header/nav/footer/scripts) as existing subpages like motor.html</w:t>
+        <w:t>New legal pages use the same HTML shell as existing pages (same header, nav, footer, scripts)</w:t>
       </w:r>
     </w:p>
     <w:p>
@@ -481,7 +691,7 @@
         <w:pStyle w:val="ListBullet"/>
       </w:pPr>
       <w:r>
-        <w:t>All styles use CSS variables (--accent-color, --surface-color, --background-color, --default-color) ensuring automatic dark mode compatibility</w:t>
+        <w:t>All styles use CSS variables — automatic dark mode compatibility, no extra code needed</w:t>
       </w:r>
     </w:p>
     <w:p>
@@ -489,7 +699,7 @@
         <w:pStyle w:val="ListBullet"/>
       </w:pPr>
       <w:r>
-        <w:t>CMP script is a standalone IIFE — no dependencies, no conflicts with existing JS</w:t>
+        <w:t>CMP is a standalone script — no dependencies, no conflicts with existing JavaScript</w:t>
       </w:r>
     </w:p>
     <w:p>
@@ -497,7 +707,7 @@
         <w:pStyle w:val="ListBullet"/>
       </w:pPr>
       <w:r>
-        <w:t>CMP dynamically creates its DOM elements on page load — no HTML templates to maintain per-page</w:t>
+        <w:t>Text replacements were surgical — only the specific problematic phrases were changed</w:t>
       </w:r>
     </w:p>
     <w:p>
@@ -505,23 +715,7 @@
         <w:pStyle w:val="ListBullet"/>
       </w:pPr>
       <w:r>
-        <w:t>Consent worker is completely decoupled — CMP fails silently if the worker is unreachable</w:t>
-      </w:r>
-    </w:p>
-    <w:p>
-      <w:pPr>
-        <w:pStyle w:val="ListBullet"/>
-      </w:pPr>
-      <w:r>
-        <w:t>Text replacements for claims were surgical — only the specific misleading phrases were changed</w:t>
-      </w:r>
-    </w:p>
-    <w:p>
-      <w:pPr>
-        <w:pStyle w:val="ListBullet"/>
-      </w:pPr>
-      <w:r>
-        <w:t>Video poster was extracted programmatically from the actual video file to ensure visual consistency</w:t>
+        <w:t>Both EN and EL pages were updated simultaneously to maintain language parity</w:t>
       </w:r>
     </w:p>
     <w:p>
@@ -529,12 +723,350 @@
         <w:pStyle w:val="Heading1"/>
       </w:pPr>
       <w:r>
-        <w:t>4. Remaining Items (CEO Action Required)</w:t>
+        <w:t>4. Verification Results</w:t>
       </w:r>
     </w:p>
     <w:p>
       <w:r>
-        <w:t>Three placeholders in the Disclosures page (disclosures.html + EL/disclosures.html) require regulatory information that only the CEO/business owner can provide:</w:t>
+        <w:t>All 13 automated checks passed:</w:t>
+      </w:r>
+    </w:p>
+    <w:tbl>
+      <w:tblPr>
+        <w:tblStyle w:val="TableGrid"/>
+        <w:tblW w:type="auto" w:w="0"/>
+        <w:tblLook w:firstColumn="1" w:firstRow="1" w:lastColumn="0" w:lastRow="0" w:noHBand="0" w:noVBand="1" w:val="04A0"/>
+      </w:tblPr>
+      <w:tblGrid>
+        <w:gridCol w:w="4320"/>
+        <w:gridCol w:w="4320"/>
+      </w:tblGrid>
+      <w:tr>
+        <w:tc>
+          <w:tcPr>
+            <w:tcW w:type="dxa" w:w="4320"/>
+          </w:tcPr>
+          <w:p>
+            <w:r>
+              <w:rPr>
+                <w:b/>
+              </w:rPr>
+              <w:t>Check</w:t>
+            </w:r>
+          </w:p>
+        </w:tc>
+        <w:tc>
+          <w:tcPr>
+            <w:tcW w:type="dxa" w:w="4320"/>
+          </w:tcPr>
+          <w:p>
+            <w:r>
+              <w:rPr>
+                <w:b/>
+              </w:rPr>
+              <w:t>Result</w:t>
+            </w:r>
+          </w:p>
+        </w:tc>
+      </w:tr>
+      <w:tr>
+        <w:tc>
+          <w:tcPr>
+            <w:tcW w:type="dxa" w:w="4320"/>
+          </w:tcPr>
+          <w:p>
+            <w:r>
+              <w:t>All 20 files load (HTTP 200)</w:t>
+            </w:r>
+          </w:p>
+        </w:tc>
+        <w:tc>
+          <w:tcPr>
+            <w:tcW w:type="dxa" w:w="4320"/>
+          </w:tcPr>
+          <w:p>
+            <w:r>
+              <w:t>✓ Pass</w:t>
+            </w:r>
+          </w:p>
+        </w:tc>
+      </w:tr>
+      <w:tr>
+        <w:tc>
+          <w:tcPr>
+            <w:tcW w:type="dxa" w:w="4320"/>
+          </w:tcPr>
+          <w:p>
+            <w:r>
+              <w:t>Security headers on all 18 pages</w:t>
+            </w:r>
+          </w:p>
+        </w:tc>
+        <w:tc>
+          <w:tcPr>
+            <w:tcW w:type="dxa" w:w="4320"/>
+          </w:tcPr>
+          <w:p>
+            <w:r>
+              <w:t>✓ Pass</w:t>
+            </w:r>
+          </w:p>
+        </w:tc>
+      </w:tr>
+      <w:tr>
+        <w:tc>
+          <w:tcPr>
+            <w:tcW w:type="dxa" w:w="4320"/>
+          </w:tcPr>
+          <w:p>
+            <w:r>
+              <w:t>Footer legal links (5) on all 18 pages</w:t>
+            </w:r>
+          </w:p>
+        </w:tc>
+        <w:tc>
+          <w:tcPr>
+            <w:tcW w:type="dxa" w:w="4320"/>
+          </w:tcPr>
+          <w:p>
+            <w:r>
+              <w:t>✓ Pass</w:t>
+            </w:r>
+          </w:p>
+        </w:tc>
+      </w:tr>
+      <w:tr>
+        <w:tc>
+          <w:tcPr>
+            <w:tcW w:type="dxa" w:w="4320"/>
+          </w:tcPr>
+          <w:p>
+            <w:r>
+              <w:t>AI chatbot disclosure on all 10 main pages</w:t>
+            </w:r>
+          </w:p>
+        </w:tc>
+        <w:tc>
+          <w:tcPr>
+            <w:tcW w:type="dxa" w:w="4320"/>
+          </w:tcPr>
+          <w:p>
+            <w:r>
+              <w:t>✓ Pass</w:t>
+            </w:r>
+          </w:p>
+        </w:tc>
+      </w:tr>
+      <w:tr>
+        <w:tc>
+          <w:tcPr>
+            <w:tcW w:type="dxa" w:w="4320"/>
+          </w:tcPr>
+          <w:p>
+            <w:r>
+              <w:t>CMP script on all 18 pages</w:t>
+            </w:r>
+          </w:p>
+        </w:tc>
+        <w:tc>
+          <w:tcPr>
+            <w:tcW w:type="dxa" w:w="4320"/>
+          </w:tcPr>
+          <w:p>
+            <w:r>
+              <w:t>✓ Pass</w:t>
+            </w:r>
+          </w:p>
+        </w:tc>
+      </w:tr>
+      <w:tr>
+        <w:tc>
+          <w:tcPr>
+            <w:tcW w:type="dxa" w:w="4320"/>
+          </w:tcPr>
+          <w:p>
+            <w:r>
+              <w:t>Zero banned text patterns (17 patterns)</w:t>
+            </w:r>
+          </w:p>
+        </w:tc>
+        <w:tc>
+          <w:tcPr>
+            <w:tcW w:type="dxa" w:w="4320"/>
+          </w:tcPr>
+          <w:p>
+            <w:r>
+              <w:t>✓ Pass</w:t>
+            </w:r>
+          </w:p>
+        </w:tc>
+      </w:tr>
+      <w:tr>
+        <w:tc>
+          <w:tcPr>
+            <w:tcW w:type="dxa" w:w="4320"/>
+          </w:tcPr>
+          <w:p>
+            <w:r>
+              <w:t>Video: preload, poster, reduced-motion</w:t>
+            </w:r>
+          </w:p>
+        </w:tc>
+        <w:tc>
+          <w:tcPr>
+            <w:tcW w:type="dxa" w:w="4320"/>
+          </w:tcPr>
+          <w:p>
+            <w:r>
+              <w:t>✓ Pass</w:t>
+            </w:r>
+          </w:p>
+        </w:tc>
+      </w:tr>
+      <w:tr>
+        <w:tc>
+          <w:tcPr>
+            <w:tcW w:type="dxa" w:w="4320"/>
+          </w:tcPr>
+          <w:p>
+            <w:r>
+              <w:t>Reduced motion CSS in both stylesheets</w:t>
+            </w:r>
+          </w:p>
+        </w:tc>
+        <w:tc>
+          <w:tcPr>
+            <w:tcW w:type="dxa" w:w="4320"/>
+          </w:tcPr>
+          <w:p>
+            <w:r>
+              <w:t>✓ Pass</w:t>
+            </w:r>
+          </w:p>
+        </w:tc>
+      </w:tr>
+      <w:tr>
+        <w:tc>
+          <w:tcPr>
+            <w:tcW w:type="dxa" w:w="4320"/>
+          </w:tcPr>
+          <w:p>
+            <w:r>
+              <w:t>Cookie table populated (not placeholder)</w:t>
+            </w:r>
+          </w:p>
+        </w:tc>
+        <w:tc>
+          <w:tcPr>
+            <w:tcW w:type="dxa" w:w="4320"/>
+          </w:tcPr>
+          <w:p>
+            <w:r>
+              <w:t>✓ Pass</w:t>
+            </w:r>
+          </w:p>
+        </w:tc>
+      </w:tr>
+      <w:tr>
+        <w:tc>
+          <w:tcPr>
+            <w:tcW w:type="dxa" w:w="4320"/>
+          </w:tcPr>
+          <w:p>
+            <w:r>
+              <w:t>XSS fix verified (textContent, no innerHTML)</w:t>
+            </w:r>
+          </w:p>
+        </w:tc>
+        <w:tc>
+          <w:tcPr>
+            <w:tcW w:type="dxa" w:w="4320"/>
+          </w:tcPr>
+          <w:p>
+            <w:r>
+              <w:t>✓ Pass</w:t>
+            </w:r>
+          </w:p>
+        </w:tc>
+      </w:tr>
+      <w:tr>
+        <w:tc>
+          <w:tcPr>
+            <w:tcW w:type="dxa" w:w="4320"/>
+          </w:tcPr>
+          <w:p>
+            <w:r>
+              <w:t>Consent worker responds (HTTP 200)</w:t>
+            </w:r>
+          </w:p>
+        </w:tc>
+        <w:tc>
+          <w:tcPr>
+            <w:tcW w:type="dxa" w:w="4320"/>
+          </w:tcPr>
+          <w:p>
+            <w:r>
+              <w:t>✓ Pass</w:t>
+            </w:r>
+          </w:p>
+        </w:tc>
+      </w:tr>
+      <w:tr>
+        <w:tc>
+          <w:tcPr>
+            <w:tcW w:type="dxa" w:w="4320"/>
+          </w:tcPr>
+          <w:p>
+            <w:r>
+              <w:t>robots.txt present</w:t>
+            </w:r>
+          </w:p>
+        </w:tc>
+        <w:tc>
+          <w:tcPr>
+            <w:tcW w:type="dxa" w:w="4320"/>
+          </w:tcPr>
+          <w:p>
+            <w:r>
+              <w:t>✓ Pass</w:t>
+            </w:r>
+          </w:p>
+        </w:tc>
+      </w:tr>
+      <w:tr>
+        <w:tc>
+          <w:tcPr>
+            <w:tcW w:type="dxa" w:w="4320"/>
+          </w:tcPr>
+          <w:p>
+            <w:r>
+              <w:t>sitemap.xml with 18 URLs</w:t>
+            </w:r>
+          </w:p>
+        </w:tc>
+        <w:tc>
+          <w:tcPr>
+            <w:tcW w:type="dxa" w:w="4320"/>
+          </w:tcPr>
+          <w:p>
+            <w:r>
+              <w:t>✓ Pass</w:t>
+            </w:r>
+          </w:p>
+        </w:tc>
+      </w:tr>
+    </w:tbl>
+    <w:p>
+      <w:pPr>
+        <w:pStyle w:val="Heading1"/>
+      </w:pPr>
+      <w:r>
+        <w:t>5. Remaining Items (CEO Action Required)</w:t>
+      </w:r>
+    </w:p>
+    <w:p>
+      <w:r>
+        <w:t>Three placeholders in the Disclosures page (disclosures.html + EL/disclosures.html) require regulatory information that only the CEO can provide:</w:t>
       </w:r>
     </w:p>
     <w:tbl>
@@ -689,7 +1221,7 @@
     <w:p/>
     <w:p>
       <w:r>
-        <w:t>Once these values are provided, they need to be updated in both the English and Greek versions of the disclosures page. No other changes are needed for go-live.</w:t>
+        <w:t>Once these values are provided, they will be updated in both the English and Greek versions. No other changes are needed for go-live.</w:t>
       </w:r>
     </w:p>
     <w:p>
@@ -697,7 +1229,68 @@
         <w:pStyle w:val="Heading1"/>
       </w:pPr>
       <w:r>
-        <w:t>5. Files Summary</w:t>
+        <w:t>6. Production Checklist (Before Going Live)</w:t>
+      </w:r>
+    </w:p>
+    <w:p>
+      <w:r>
+        <w:t>Once a domain is chosen and hosting is set up:</w:t>
+      </w:r>
+    </w:p>
+    <w:p>
+      <w:pPr>
+        <w:pStyle w:val="ListBullet"/>
+      </w:pPr>
+      <w:r>
+        <w:t>Update CORS in consent worker from wildcard (*) to your production domain</w:t>
+      </w:r>
+    </w:p>
+    <w:p>
+      <w:pPr>
+        <w:pStyle w:val="ListBullet"/>
+      </w:pPr>
+      <w:r>
+        <w:t>Update sitemap.xml domain from eacinsurance.com to your actual domain</w:t>
+      </w:r>
+    </w:p>
+    <w:p>
+      <w:pPr>
+        <w:pStyle w:val="ListBullet"/>
+      </w:pPr>
+      <w:r>
+        <w:t>Update robots.txt Sitemap URL to your actual domain</w:t>
+      </w:r>
+    </w:p>
+    <w:p>
+      <w:pPr>
+        <w:pStyle w:val="ListBullet"/>
+      </w:pPr>
+      <w:r>
+        <w:t>Redeploy the Cloudflare Worker if domain changes: npx wrangler deploy</w:t>
+      </w:r>
+    </w:p>
+    <w:p>
+      <w:pPr>
+        <w:pStyle w:val="ListBullet"/>
+      </w:pPr>
+      <w:r>
+        <w:t>Submit sitemap to Google Search Console</w:t>
+      </w:r>
+    </w:p>
+    <w:p>
+      <w:pPr>
+        <w:pStyle w:val="ListBullet"/>
+      </w:pPr>
+      <w:r>
+        <w:t>Run a final Lighthouse audit for performance scores</w:t>
+      </w:r>
+    </w:p>
+    <w:p>
+      <w:pPr>
+        <w:pStyle w:val="Heading1"/>
+      </w:pPr>
+      <w:r>
+        <w:t>7. Files Summary</w:t>
       </w:r>
     </w:p>
     <w:p>
@@ -705,7 +1298,7 @@
         <w:pStyle w:val="Heading2"/>
       </w:pPr>
       <w:r>
-        <w:t>New Files Created</w:t>
+        <w:t>New Files Created (12)</w:t>
       </w:r>
     </w:p>
     <w:p>
@@ -713,7 +1306,7 @@
         <w:pStyle w:val="ListBullet"/>
       </w:pPr>
       <w:r>
-        <w:t>privacy-policy.html — EN Privacy Policy</w:t>
+        <w:t>privacy-policy.html + EL/privacy-policy.html — Privacy Policy</w:t>
       </w:r>
     </w:p>
     <w:p>
@@ -721,7 +1314,7 @@
         <w:pStyle w:val="ListBullet"/>
       </w:pPr>
       <w:r>
-        <w:t>EL/privacy-policy.html — EL Privacy Policy</w:t>
+        <w:t>cookie-policy.html + EL/cookie-policy.html — Cookie Policy</w:t>
       </w:r>
     </w:p>
     <w:p>
@@ -729,7 +1322,7 @@
         <w:pStyle w:val="ListBullet"/>
       </w:pPr>
       <w:r>
-        <w:t>cookie-policy.html — EN Cookie Policy</w:t>
+        <w:t>disclosures.html + EL/disclosures.html — Disclosures / IIID</w:t>
       </w:r>
     </w:p>
     <w:p>
@@ -737,23 +1330,7 @@
         <w:pStyle w:val="ListBullet"/>
       </w:pPr>
       <w:r>
-        <w:t>EL/cookie-policy.html — EL Cookie Policy</w:t>
-      </w:r>
-    </w:p>
-    <w:p>
-      <w:pPr>
-        <w:pStyle w:val="ListBullet"/>
-      </w:pPr>
-      <w:r>
-        <w:t>disclosures.html — EN Disclosures/IIID</w:t>
-      </w:r>
-    </w:p>
-    <w:p>
-      <w:pPr>
-        <w:pStyle w:val="ListBullet"/>
-      </w:pPr>
-      <w:r>
-        <w:t>EL/disclosures.html — EL Disclosures/IIID</w:t>
+        <w:t>terms.html + EL/terms.html — Terms &amp; Conditions</w:t>
       </w:r>
     </w:p>
     <w:p>
@@ -777,7 +1354,7 @@
         <w:pStyle w:val="ListBullet"/>
       </w:pPr>
       <w:r>
-        <w:t>consent-worker/worker.js — Cloudflare Worker for consent logging</w:t>
+        <w:t>consent-worker/worker.js — Cloudflare Worker</w:t>
       </w:r>
     </w:p>
     <w:p>
@@ -790,10 +1367,10 @@
     </w:p>
     <w:p>
       <w:pPr>
-        <w:pStyle w:val="Heading2"/>
+        <w:pStyle w:val="ListBullet"/>
       </w:pPr>
       <w:r>
-        <w:t>Modified Files</w:t>
+        <w:t>robots.txt — Search engine directives</w:t>
       </w:r>
     </w:p>
     <w:p>
@@ -801,7 +1378,15 @@
         <w:pStyle w:val="ListBullet"/>
       </w:pPr>
       <w:r>
-        <w:t>main.html — CMP, footer links, AI disclosure, claims text, video poster, reduced motion JS</w:t>
+        <w:t>sitemap.xml — Sitemap with 18 URLs</w:t>
+      </w:r>
+    </w:p>
+    <w:p>
+      <w:pPr>
+        <w:pStyle w:val="Heading2"/>
+      </w:pPr>
+      <w:r>
+        <w:t>Modified Files (12)</w:t>
       </w:r>
     </w:p>
     <w:p>
@@ -809,7 +1394,7 @@
         <w:pStyle w:val="ListBullet"/>
       </w:pPr>
       <w:r>
-        <w:t>EL/main.html — Same as above (Greek) + duplicate heading fix</w:t>
+        <w:t>main.html + EL/main.html — All compliance changes (CMP, footer, claims text, video, security headers, stats)</w:t>
       </w:r>
     </w:p>
     <w:p>
@@ -817,7 +1402,7 @@
         <w:pStyle w:val="ListBullet"/>
       </w:pPr>
       <w:r>
-        <w:t>motor.html + EL/motor.html — CMP, footer links, AI disclosure, claims text fix</w:t>
+        <w:t>motor.html + EL/motor.html — CMP, footer, claims text, alt text, security headers</w:t>
       </w:r>
     </w:p>
     <w:p>
@@ -825,7 +1410,7 @@
         <w:pStyle w:val="ListBullet"/>
       </w:pPr>
       <w:r>
-        <w:t>health.html + EL/health.html — CMP, footer links, AI disclosure, claims text fix</w:t>
+        <w:t>health.html + EL/health.html — CMP, footer, claims text, alt text, security headers</w:t>
       </w:r>
     </w:p>
     <w:p>
@@ -833,7 +1418,7 @@
         <w:pStyle w:val="ListBullet"/>
       </w:pPr>
       <w:r>
-        <w:t>home.html + EL/home.html — CMP, footer links, AI disclosure, claims text fix</w:t>
+        <w:t>home.html + EL/home.html — CMP, footer, claims text, alt text, security headers</w:t>
       </w:r>
     </w:p>
     <w:p>
@@ -841,7 +1426,7 @@
         <w:pStyle w:val="ListBullet"/>
       </w:pPr>
       <w:r>
-        <w:t>business.html + EL/business.html — CMP, footer links, AI disclosure</w:t>
+        <w:t>business.html + EL/business.html — CMP, footer, claims text, alt text, security headers</w:t>
       </w:r>
     </w:p>
     <w:p>
@@ -849,7 +1434,7 @@
         <w:pStyle w:val="ListBullet"/>
       </w:pPr>
       <w:r>
-        <w:t>assets/css/main.css — CMP styles, legal page styles, reduced motion, footer legal links</w:t>
+        <w:t>assets/css/main.css — CMP styles, legal page styles, reduced motion</w:t>
       </w:r>
     </w:p>
     <w:p>
@@ -857,7 +1442,15 @@
         <w:pStyle w:val="ListBullet"/>
       </w:pPr>
       <w:r>
-        <w:t>assets/css/sub.css — Same CSS additions as main.css + code colour fix</w:t>
+        <w:t>assets/css/sub.css — CMP styles, legal page styles, reduced motion, cookie code color fix</w:t>
+      </w:r>
+    </w:p>
+    <w:p>
+      <w:pPr>
+        <w:pStyle w:val="ListBullet"/>
+      </w:pPr>
+      <w:r>
+        <w:t>assets/vendor/php-email-form/validate.js — XSS fix (innerHTML → textContent)</w:t>
       </w:r>
     </w:p>
     <w:sectPr>

</xml_diff>

<commit_message>
Update compliance report: add website overview, tech stack, full text change table, nav fixes
</commit_message>
<xml_diff>
--- a/EAC_Compliance_Report.docx
+++ b/EAC_Compliance_Report.docx
@@ -7,7 +7,7 @@
         <w:pStyle w:val="Title"/>
       </w:pPr>
       <w:r>
-        <w:t>E.A.C. Insurance — Go-Live Compliance Implementation Report</w:t>
+        <w:t>E.A.C. Insurance — Go-Live Compliance Report</w:t>
       </w:r>
     </w:p>
     <w:p>
@@ -20,18 +20,594 @@
         <w:t>Prepared by: Development Team (TripleAI Consultants)</w:t>
       </w:r>
     </w:p>
+    <w:p>
+      <w:r>
+        <w:t>Repository: github.com/tripleaiconsultants/site-showcase-3</w:t>
+      </w:r>
+    </w:p>
     <w:p/>
     <w:p>
       <w:pPr>
         <w:pStyle w:val="Heading1"/>
       </w:pPr>
       <w:r>
-        <w:t>1. Overview</w:t>
+        <w:t>1. Website Overview</w:t>
+      </w:r>
+    </w:p>
+    <w:p>
+      <w:pPr>
+        <w:pStyle w:val="Heading2"/>
+      </w:pPr>
+      <w:r>
+        <w:t>1.1 Company Information</w:t>
       </w:r>
     </w:p>
     <w:p>
       <w:r>
-        <w:t>This document summarises all compliance, security, and performance changes implemented on the E.A.C. Insurance website following a pre-launch audit. The audit identified critical blockers across GDPR/ePrivacy, IDD (Insurance Distribution Directive), AI Act transparency, accessibility (WCAG), Core Web Vitals performance, and website security. All identified issues have been addressed except for three regulatory placeholders that require CEO input.</w:t>
+        <w:rPr>
+          <w:b/>
+        </w:rPr>
+        <w:t xml:space="preserve">Legal Name: </w:t>
+      </w:r>
+      <w:r>
+        <w:t>E.A.C. Insurance Agencies &amp; Consultants Ltd</w:t>
+      </w:r>
+    </w:p>
+    <w:p>
+      <w:r>
+        <w:rPr>
+          <w:b/>
+        </w:rPr>
+        <w:t xml:space="preserve">Trading Name: </w:t>
+      </w:r>
+      <w:r>
+        <w:t>E.A.C. Insurance</w:t>
+      </w:r>
+    </w:p>
+    <w:p>
+      <w:r>
+        <w:rPr>
+          <w:b/>
+        </w:rPr>
+        <w:t xml:space="preserve">Website Domain: </w:t>
+      </w:r>
+      <w:r>
+        <w:t>To be confirmed (currently hosted on GitHub)</w:t>
+      </w:r>
+    </w:p>
+    <w:p>
+      <w:r>
+        <w:rPr>
+          <w:b/>
+        </w:rPr>
+        <w:t xml:space="preserve">Address: </w:t>
+      </w:r>
+      <w:r>
+        <w:t>Apostolou Varnava 51A, 3065 Limassol, Cyprus</w:t>
+      </w:r>
+    </w:p>
+    <w:p>
+      <w:r>
+        <w:rPr>
+          <w:b/>
+        </w:rPr>
+        <w:t xml:space="preserve">Phone: </w:t>
+      </w:r>
+      <w:r>
+        <w:t>+357 96 660 113</w:t>
+      </w:r>
+    </w:p>
+    <w:p>
+      <w:r>
+        <w:rPr>
+          <w:b/>
+        </w:rPr>
+        <w:t xml:space="preserve">Fax: </w:t>
+      </w:r>
+      <w:r>
+        <w:t>+357 25 250 239</w:t>
+      </w:r>
+    </w:p>
+    <w:p>
+      <w:r>
+        <w:rPr>
+          <w:b/>
+        </w:rPr>
+        <w:t xml:space="preserve">Email: </w:t>
+      </w:r>
+      <w:r>
+        <w:t>e.a.c.insurances@outlook.com</w:t>
+      </w:r>
+    </w:p>
+    <w:p>
+      <w:r>
+        <w:rPr>
+          <w:b/>
+        </w:rPr>
+        <w:t xml:space="preserve">CEO: </w:t>
+      </w:r>
+      <w:r>
+        <w:t>Andros Panayiotou</w:t>
+      </w:r>
+    </w:p>
+    <w:p>
+      <w:pPr>
+        <w:pStyle w:val="Heading2"/>
+      </w:pPr>
+      <w:r>
+        <w:t>1.2 Website Structure</w:t>
+      </w:r>
+    </w:p>
+    <w:p>
+      <w:r>
+        <w:t>The website is bilingual (English + Greek) with the following pages:</w:t>
+      </w:r>
+    </w:p>
+    <w:tbl>
+      <w:tblPr>
+        <w:tblStyle w:val="TableGrid"/>
+        <w:tblW w:type="auto" w:w="0"/>
+        <w:tblLook w:firstColumn="1" w:firstRow="1" w:lastColumn="0" w:lastRow="0" w:noHBand="0" w:noVBand="1" w:val="04A0"/>
+      </w:tblPr>
+      <w:tblGrid>
+        <w:gridCol w:w="2880"/>
+        <w:gridCol w:w="2880"/>
+        <w:gridCol w:w="2880"/>
+      </w:tblGrid>
+      <w:tr>
+        <w:tc>
+          <w:tcPr>
+            <w:tcW w:type="dxa" w:w="2880"/>
+          </w:tcPr>
+          <w:p>
+            <w:r>
+              <w:rPr>
+                <w:b/>
+              </w:rPr>
+              <w:t>Page</w:t>
+            </w:r>
+          </w:p>
+        </w:tc>
+        <w:tc>
+          <w:tcPr>
+            <w:tcW w:type="dxa" w:w="2880"/>
+          </w:tcPr>
+          <w:p>
+            <w:r>
+              <w:rPr>
+                <w:b/>
+              </w:rPr>
+              <w:t>English URL</w:t>
+            </w:r>
+          </w:p>
+        </w:tc>
+        <w:tc>
+          <w:tcPr>
+            <w:tcW w:type="dxa" w:w="2880"/>
+          </w:tcPr>
+          <w:p>
+            <w:r>
+              <w:rPr>
+                <w:b/>
+              </w:rPr>
+              <w:t>Greek URL</w:t>
+            </w:r>
+          </w:p>
+        </w:tc>
+      </w:tr>
+      <w:tr>
+        <w:tc>
+          <w:tcPr>
+            <w:tcW w:type="dxa" w:w="2880"/>
+          </w:tcPr>
+          <w:p>
+            <w:r>
+              <w:t>Main / Landing Page</w:t>
+            </w:r>
+          </w:p>
+        </w:tc>
+        <w:tc>
+          <w:tcPr>
+            <w:tcW w:type="dxa" w:w="2880"/>
+          </w:tcPr>
+          <w:p>
+            <w:r>
+              <w:t>main.html</w:t>
+            </w:r>
+          </w:p>
+        </w:tc>
+        <w:tc>
+          <w:tcPr>
+            <w:tcW w:type="dxa" w:w="2880"/>
+          </w:tcPr>
+          <w:p>
+            <w:r>
+              <w:t>EL/main.html</w:t>
+            </w:r>
+          </w:p>
+        </w:tc>
+      </w:tr>
+      <w:tr>
+        <w:tc>
+          <w:tcPr>
+            <w:tcW w:type="dxa" w:w="2880"/>
+          </w:tcPr>
+          <w:p>
+            <w:r>
+              <w:t>Motor Insurance</w:t>
+            </w:r>
+          </w:p>
+        </w:tc>
+        <w:tc>
+          <w:tcPr>
+            <w:tcW w:type="dxa" w:w="2880"/>
+          </w:tcPr>
+          <w:p>
+            <w:r>
+              <w:t>motor.html</w:t>
+            </w:r>
+          </w:p>
+        </w:tc>
+        <w:tc>
+          <w:tcPr>
+            <w:tcW w:type="dxa" w:w="2880"/>
+          </w:tcPr>
+          <w:p>
+            <w:r>
+              <w:t>EL/motor.html</w:t>
+            </w:r>
+          </w:p>
+        </w:tc>
+      </w:tr>
+      <w:tr>
+        <w:tc>
+          <w:tcPr>
+            <w:tcW w:type="dxa" w:w="2880"/>
+          </w:tcPr>
+          <w:p>
+            <w:r>
+              <w:t>Health Insurance</w:t>
+            </w:r>
+          </w:p>
+        </w:tc>
+        <w:tc>
+          <w:tcPr>
+            <w:tcW w:type="dxa" w:w="2880"/>
+          </w:tcPr>
+          <w:p>
+            <w:r>
+              <w:t>health.html</w:t>
+            </w:r>
+          </w:p>
+        </w:tc>
+        <w:tc>
+          <w:tcPr>
+            <w:tcW w:type="dxa" w:w="2880"/>
+          </w:tcPr>
+          <w:p>
+            <w:r>
+              <w:t>EL/health.html</w:t>
+            </w:r>
+          </w:p>
+        </w:tc>
+      </w:tr>
+      <w:tr>
+        <w:tc>
+          <w:tcPr>
+            <w:tcW w:type="dxa" w:w="2880"/>
+          </w:tcPr>
+          <w:p>
+            <w:r>
+              <w:t>Home Insurance</w:t>
+            </w:r>
+          </w:p>
+        </w:tc>
+        <w:tc>
+          <w:tcPr>
+            <w:tcW w:type="dxa" w:w="2880"/>
+          </w:tcPr>
+          <w:p>
+            <w:r>
+              <w:t>home.html</w:t>
+            </w:r>
+          </w:p>
+        </w:tc>
+        <w:tc>
+          <w:tcPr>
+            <w:tcW w:type="dxa" w:w="2880"/>
+          </w:tcPr>
+          <w:p>
+            <w:r>
+              <w:t>EL/home.html</w:t>
+            </w:r>
+          </w:p>
+        </w:tc>
+      </w:tr>
+      <w:tr>
+        <w:tc>
+          <w:tcPr>
+            <w:tcW w:type="dxa" w:w="2880"/>
+          </w:tcPr>
+          <w:p>
+            <w:r>
+              <w:t>Business Insurance</w:t>
+            </w:r>
+          </w:p>
+        </w:tc>
+        <w:tc>
+          <w:tcPr>
+            <w:tcW w:type="dxa" w:w="2880"/>
+          </w:tcPr>
+          <w:p>
+            <w:r>
+              <w:t>business.html</w:t>
+            </w:r>
+          </w:p>
+        </w:tc>
+        <w:tc>
+          <w:tcPr>
+            <w:tcW w:type="dxa" w:w="2880"/>
+          </w:tcPr>
+          <w:p>
+            <w:r>
+              <w:t>EL/business.html</w:t>
+            </w:r>
+          </w:p>
+        </w:tc>
+      </w:tr>
+      <w:tr>
+        <w:tc>
+          <w:tcPr>
+            <w:tcW w:type="dxa" w:w="2880"/>
+          </w:tcPr>
+          <w:p>
+            <w:r>
+              <w:t>Privacy Policy</w:t>
+            </w:r>
+          </w:p>
+        </w:tc>
+        <w:tc>
+          <w:tcPr>
+            <w:tcW w:type="dxa" w:w="2880"/>
+          </w:tcPr>
+          <w:p>
+            <w:r>
+              <w:t>privacy-policy.html</w:t>
+            </w:r>
+          </w:p>
+        </w:tc>
+        <w:tc>
+          <w:tcPr>
+            <w:tcW w:type="dxa" w:w="2880"/>
+          </w:tcPr>
+          <w:p>
+            <w:r>
+              <w:t>EL/privacy-policy.html</w:t>
+            </w:r>
+          </w:p>
+        </w:tc>
+      </w:tr>
+      <w:tr>
+        <w:tc>
+          <w:tcPr>
+            <w:tcW w:type="dxa" w:w="2880"/>
+          </w:tcPr>
+          <w:p>
+            <w:r>
+              <w:t>Cookie Policy</w:t>
+            </w:r>
+          </w:p>
+        </w:tc>
+        <w:tc>
+          <w:tcPr>
+            <w:tcW w:type="dxa" w:w="2880"/>
+          </w:tcPr>
+          <w:p>
+            <w:r>
+              <w:t>cookie-policy.html</w:t>
+            </w:r>
+          </w:p>
+        </w:tc>
+        <w:tc>
+          <w:tcPr>
+            <w:tcW w:type="dxa" w:w="2880"/>
+          </w:tcPr>
+          <w:p>
+            <w:r>
+              <w:t>EL/cookie-policy.html</w:t>
+            </w:r>
+          </w:p>
+        </w:tc>
+      </w:tr>
+      <w:tr>
+        <w:tc>
+          <w:tcPr>
+            <w:tcW w:type="dxa" w:w="2880"/>
+          </w:tcPr>
+          <w:p>
+            <w:r>
+              <w:t>Disclosures (IIID)</w:t>
+            </w:r>
+          </w:p>
+        </w:tc>
+        <w:tc>
+          <w:tcPr>
+            <w:tcW w:type="dxa" w:w="2880"/>
+          </w:tcPr>
+          <w:p>
+            <w:r>
+              <w:t>disclosures.html</w:t>
+            </w:r>
+          </w:p>
+        </w:tc>
+        <w:tc>
+          <w:tcPr>
+            <w:tcW w:type="dxa" w:w="2880"/>
+          </w:tcPr>
+          <w:p>
+            <w:r>
+              <w:t>EL/disclosures.html</w:t>
+            </w:r>
+          </w:p>
+        </w:tc>
+      </w:tr>
+      <w:tr>
+        <w:tc>
+          <w:tcPr>
+            <w:tcW w:type="dxa" w:w="2880"/>
+          </w:tcPr>
+          <w:p>
+            <w:r>
+              <w:t>Terms &amp; Conditions</w:t>
+            </w:r>
+          </w:p>
+        </w:tc>
+        <w:tc>
+          <w:tcPr>
+            <w:tcW w:type="dxa" w:w="2880"/>
+          </w:tcPr>
+          <w:p>
+            <w:r>
+              <w:t>terms.html</w:t>
+            </w:r>
+          </w:p>
+        </w:tc>
+        <w:tc>
+          <w:tcPr>
+            <w:tcW w:type="dxa" w:w="2880"/>
+          </w:tcPr>
+          <w:p>
+            <w:r>
+              <w:t>EL/terms.html</w:t>
+            </w:r>
+          </w:p>
+        </w:tc>
+      </w:tr>
+      <w:tr>
+        <w:tc>
+          <w:tcPr>
+            <w:tcW w:type="dxa" w:w="2880"/>
+          </w:tcPr>
+          <w:p>
+            <w:r>
+              <w:t>Splash / Redirect</w:t>
+            </w:r>
+          </w:p>
+        </w:tc>
+        <w:tc>
+          <w:tcPr>
+            <w:tcW w:type="dxa" w:w="2880"/>
+          </w:tcPr>
+          <w:p>
+            <w:r>
+              <w:t>index.html</w:t>
+            </w:r>
+          </w:p>
+        </w:tc>
+        <w:tc>
+          <w:tcPr>
+            <w:tcW w:type="dxa" w:w="2880"/>
+          </w:tcPr>
+          <w:p>
+            <w:r>
+              <w:t>EL/index.html</w:t>
+            </w:r>
+          </w:p>
+        </w:tc>
+      </w:tr>
+    </w:tbl>
+    <w:p/>
+    <w:p>
+      <w:r>
+        <w:t>Total: 20 HTML pages (10 EN + 10 EL), plus robots.txt and sitemap.xml.</w:t>
+      </w:r>
+    </w:p>
+    <w:p>
+      <w:pPr>
+        <w:pStyle w:val="Heading2"/>
+      </w:pPr>
+      <w:r>
+        <w:t>1.3 Technology Stack</w:t>
+      </w:r>
+    </w:p>
+    <w:p>
+      <w:pPr>
+        <w:pStyle w:val="ListBullet"/>
+      </w:pPr>
+      <w:r>
+        <w:t>Static HTML/CSS/JS website (no server-side rendering)</w:t>
+      </w:r>
+    </w:p>
+    <w:p>
+      <w:pPr>
+        <w:pStyle w:val="ListBullet"/>
+      </w:pPr>
+      <w:r>
+        <w:t>Bootstrap 5.3.3 (responsive framework)</w:t>
+      </w:r>
+    </w:p>
+    <w:p>
+      <w:pPr>
+        <w:pStyle w:val="ListBullet"/>
+      </w:pPr>
+      <w:r>
+        <w:t>Fonts: Roboto (body), Montserrat (headings), Open Sans (navigation)</w:t>
+      </w:r>
+    </w:p>
+    <w:p>
+      <w:pPr>
+        <w:pStyle w:val="ListBullet"/>
+      </w:pPr>
+      <w:r>
+        <w:t>Accent colour: #BC9042 (gold)</w:t>
+      </w:r>
+    </w:p>
+    <w:p>
+      <w:pPr>
+        <w:pStyle w:val="ListBullet"/>
+      </w:pPr>
+      <w:r>
+        <w:t>Dark mode support via CSS variables and data-theme attribute</w:t>
+      </w:r>
+    </w:p>
+    <w:p>
+      <w:pPr>
+        <w:pStyle w:val="ListBullet"/>
+      </w:pPr>
+      <w:r>
+        <w:t>Botpress Cloud v3.2 AI chatbot</w:t>
+      </w:r>
+    </w:p>
+    <w:p>
+      <w:pPr>
+        <w:pStyle w:val="ListBullet"/>
+      </w:pPr>
+      <w:r>
+        <w:t>Formspree for contact form handling</w:t>
+      </w:r>
+    </w:p>
+    <w:p>
+      <w:pPr>
+        <w:pStyle w:val="ListBullet"/>
+      </w:pPr>
+      <w:r>
+        <w:t>Cloudflare Worker for consent logging</w:t>
+      </w:r>
+    </w:p>
+    <w:p>
+      <w:pPr>
+        <w:pStyle w:val="ListBullet"/>
+      </w:pPr>
+      <w:r>
+        <w:t>AOS (Animate On Scroll) for scroll animations</w:t>
+      </w:r>
+    </w:p>
+    <w:p>
+      <w:pPr>
+        <w:pStyle w:val="ListBullet"/>
+      </w:pPr>
+      <w:r>
+        <w:t>Swiper.js for testimonial carousels</w:t>
       </w:r>
     </w:p>
     <w:p>
@@ -52,18 +628,13 @@
     </w:p>
     <w:p>
       <w:r>
-        <w:t>Four legal pages were created in both English and Greek:</w:t>
-      </w:r>
-    </w:p>
-    <w:p>
-      <w:r>
         <w:rPr>
           <w:b/>
         </w:rPr>
         <w:t xml:space="preserve">Privacy Policy (privacy-policy.html + EL/privacy-policy.html): </w:t>
       </w:r>
       <w:r>
-        <w:t>Full GDPR-compliant privacy policy. Includes: data controller details, data collected (contact form, technical logs, cookies), processing purposes, legal bases (consent, pre-contractual measures, legitimate interest), data recipients, retention periods (24 months for inquiries, 36 months for marketing inactivity), data subject rights (access, rectification, erasure, restriction, portability, complaint), chatbot disclosure, and WhatsApp sensitive data warning.</w:t>
+        <w:t>Full GDPR-compliant privacy policy covering: data controller details, types of data collected (contact form submissions, technical logs, cookies, chatbot interactions), processing purposes and legal bases (consent, pre-contractual measures, legitimate interest), data recipients (insurance companies, IT providers), retention periods (24 months for inquiries, 36 months for marketing inactivity), all data subject rights (access, rectification, erasure, restriction, portability, objection, complaint to DPA), AI chatbot disclosure (general information only, not binding), and WhatsApp sensitive data warning (do not send health details via form/WhatsApp).</w:t>
       </w:r>
     </w:p>
     <w:p>
@@ -74,7 +645,7 @@
         <w:t xml:space="preserve">Cookie Policy (cookie-policy.html + EL/cookie-policy.html): </w:t>
       </w:r>
       <w:r>
-        <w:t>Cookie categories table (Strictly Necessary, Preferences, Analytics, Marketing) plus a detailed cookie list table documenting all storage items: cmp_consent, popupLastShown, popupMinimized, theme, and Botpress (bp:*) cookies. Links to Cookie Settings modal via CMP.</w:t>
+        <w:t>Explains cookie categories (Strictly Necessary, Preferences, Analytics, Marketing), how to manage preferences via the CMP, and includes a detailed cookie list table with all storage items used by the site: cmp_consent (consent record), popupLastShown and popupMinimized (popup widget state), theme (dark mode preference), and bp:* (Botpress chatbot cookies).</w:t>
       </w:r>
     </w:p>
     <w:p>
@@ -85,7 +656,7 @@
         <w:t xml:space="preserve">Disclosures / IIID (disclosures.html + EL/disclosures.html): </w:t>
       </w:r>
       <w:r>
-        <w:t>Insurance Intermediary Information Document (IIID) per IDD directive. Includes company details, status, registration, advice disclosure, remuneration types, complaints procedure, and disclaimer. Contains three placeholders requiring CEO input (see Section 5).</w:t>
+        <w:t>Insurance Intermediary Information Document per IDD directive. Includes: company identity and contact details, intermediary status, registration, advice disclosure, remuneration types (commission, fee, other), complaints procedure, and important notice. Contains three placeholders requiring CEO input (see Section 5).</w:t>
       </w:r>
     </w:p>
     <w:p>
@@ -96,7 +667,7 @@
         <w:t xml:space="preserve">Terms &amp; Conditions (terms.html + EL/terms.html): </w:t>
       </w:r>
       <w:r>
-        <w:t>Covers: acceptance of terms, non-binding quotes disclaimer (all quotes subject to underwriting), insurance intermediary role clarification, accuracy of information disclaimer, user responsibilities, AI chatbot disclaimer, third-party links, intellectual property, limitation of liability, formal complaints procedure (5-day acknowledgement, 30-day response, ICCS escalation), governing law (Republic of Cyprus), and changes to terms.</w:t>
+        <w:t>Covers: acceptance of terms, non-binding quotes disclaimer (all quotes subject to insurer underwriting), insurance intermediary role clarification (E.A.C. does not underwrite), accuracy of information disclaimer, user responsibilities (accurate info, material fact disclosure), AI chatbot disclaimer (general info only), third-party links, intellectual property, limitation of liability, formal complaints procedure (5-day acknowledgement, 30-day substantive response, escalation to ICCS), governing law (Republic of Cyprus), and changes to terms.</w:t>
       </w:r>
     </w:p>
     <w:p>
@@ -109,7 +680,7 @@
     </w:p>
     <w:p>
       <w:r>
-        <w:t>Created a self-contained, bilingual cookie consent banner (assets/js/cmp.js). The script auto-detects the page language by checking if the URL path contains /EL/. Features:</w:t>
+        <w:t>File: assets/js/cmp.js — Self-contained, bilingual cookie consent system.</w:t>
       </w:r>
     </w:p>
     <w:p>
@@ -117,7 +688,7 @@
         <w:pStyle w:val="ListBullet"/>
       </w:pPr>
       <w:r>
-        <w:t>Bottom-fixed banner with three options: Accept All, Reject Non-Essential, Settings</w:t>
+        <w:t>Bottom-fixed banner appears on first visit with three options: Accept All, Reject Non-Essential, Settings</w:t>
       </w:r>
     </w:p>
     <w:p>
@@ -125,7 +696,7 @@
         <w:pStyle w:val="ListBullet"/>
       </w:pPr>
       <w:r>
-        <w:t>Settings modal with per-category toggles: Strictly Necessary (always on), Preferences, Analytics, Marketing</w:t>
+        <w:t>Settings modal with per-category toggles: Strictly Necessary (always on, cannot be disabled), Preferences, Analytics, Marketing</w:t>
       </w:r>
     </w:p>
     <w:p>
@@ -133,7 +704,7 @@
         <w:pStyle w:val="ListBullet"/>
       </w:pPr>
       <w:r>
-        <w:t>Consent stored in localStorage as JSON with unique consent ID, timestamp, and policy version</w:t>
+        <w:t>Consent stored in localStorage as JSON with: unique consent ID, ISO timestamp, policy version, per-category choices, and page path</w:t>
       </w:r>
     </w:p>
     <w:p>
@@ -141,7 +712,7 @@
         <w:pStyle w:val="ListBullet"/>
       </w:pPr>
       <w:r>
-        <w:t>Footer "Cookie Settings" link opens the CMP modal on every page</w:t>
+        <w:t>Auto-detects language from URL path (/EL/ = Greek, otherwise English)</w:t>
       </w:r>
     </w:p>
     <w:p>
@@ -149,7 +720,7 @@
         <w:pStyle w:val="ListBullet"/>
       </w:pPr>
       <w:r>
-        <w:t>Added to all 18 pages (10 existing + 8 new legal pages)</w:t>
+        <w:t>Footer "Cookie Settings" link on every page opens the CMP modal so users can change preferences at any time</w:t>
       </w:r>
     </w:p>
     <w:p>
@@ -157,7 +728,31 @@
         <w:pStyle w:val="ListBullet"/>
       </w:pPr>
       <w:r>
-        <w:t>Styled to match existing site design (gold accent, dark mode compatible, same fonts and button styles)</w:t>
+        <w:t>Fires cmp:consent-updated custom JavaScript event for future integration with analytics tools</w:t>
+      </w:r>
+    </w:p>
+    <w:p>
+      <w:pPr>
+        <w:pStyle w:val="ListBullet"/>
+      </w:pPr>
+      <w:r>
+        <w:t>Z-index 200000 ensures it stacks above all existing page elements</w:t>
+      </w:r>
+    </w:p>
+    <w:p>
+      <w:pPr>
+        <w:pStyle w:val="ListBullet"/>
+      </w:pPr>
+      <w:r>
+        <w:t>Styled to match existing site design: gold accent colour, dark mode compatible, same fonts and rounded buttons</w:t>
+      </w:r>
+    </w:p>
+    <w:p>
+      <w:pPr>
+        <w:pStyle w:val="ListBullet"/>
+      </w:pPr>
+      <w:r>
+        <w:t>Added to all 18 HTML pages</w:t>
       </w:r>
     </w:p>
     <w:p>
@@ -165,7 +760,7 @@
         <w:pStyle w:val="Heading2"/>
       </w:pPr>
       <w:r>
-        <w:t>2.3 Server-Side Consent Logging (Cloudflare Worker)</w:t>
+        <w:t>2.3 Server-Side Consent Logging</w:t>
       </w:r>
     </w:p>
     <w:p>
@@ -178,7 +773,7 @@
         <w:pStyle w:val="ListBullet"/>
       </w:pPr>
       <w:r>
-        <w:t>Worker URL: https://eac-consent-log.marinosantoniou3009.workers.dev</w:t>
+        <w:t>Worker URL: https://eac-consent-log.marinosantoniou3009.workers.dev/consent/log</w:t>
       </w:r>
     </w:p>
     <w:p>
@@ -186,7 +781,7 @@
         <w:pStyle w:val="ListBullet"/>
       </w:pPr>
       <w:r>
-        <w:t>Receives consent data automatically when a visitor makes a cookie choice</w:t>
+        <w:t>Automatically receives a POST request every time a visitor makes a cookie choice</w:t>
       </w:r>
     </w:p>
     <w:p>
@@ -194,7 +789,7 @@
         <w:pStyle w:val="ListBullet"/>
       </w:pPr>
       <w:r>
-        <w:t>Stores records in Cloudflare KV with automatic 3-year expiry</w:t>
+        <w:t>Stores each consent record in Cloudflare KV (key-value storage) keyed by consent ID</w:t>
       </w:r>
     </w:p>
     <w:p>
@@ -202,7 +797,7 @@
         <w:pStyle w:val="ListBullet"/>
       </w:pPr>
       <w:r>
-        <w:t>Adds server-side metadata: server timestamp and visitor country</w:t>
+        <w:t>Records include: consent ID, timestamp, choices per category, policy version, page path, locale</w:t>
       </w:r>
     </w:p>
     <w:p>
@@ -210,7 +805,31 @@
         <w:pStyle w:val="ListBullet"/>
       </w:pPr>
       <w:r>
-        <w:t>Free tier: 100,000 requests/day — more than sufficient</w:t>
+        <w:t>Server adds: server-side timestamp and visitor country (via Cloudflare geolocation)</w:t>
+      </w:r>
+    </w:p>
+    <w:p>
+      <w:pPr>
+        <w:pStyle w:val="ListBullet"/>
+      </w:pPr>
+      <w:r>
+        <w:t>Records auto-expire after 3 years (GDPR proof-of-consent recommendation)</w:t>
+      </w:r>
+    </w:p>
+    <w:p>
+      <w:pPr>
+        <w:pStyle w:val="ListBullet"/>
+      </w:pPr>
+      <w:r>
+        <w:t>CORS currently set to wildcard (*) — must be updated to production domain before go-live</w:t>
+      </w:r>
+    </w:p>
+    <w:p>
+      <w:pPr>
+        <w:pStyle w:val="ListBullet"/>
+      </w:pPr>
+      <w:r>
+        <w:t>Free tier: 100,000 reads/day, 1,000 writes/day — more than sufficient for launch</w:t>
       </w:r>
     </w:p>
     <w:p>
@@ -218,12 +837,12 @@
         <w:pStyle w:val="Heading2"/>
       </w:pPr>
       <w:r>
-        <w:t>2.4 IDD Text Compliance (Misleading Claims Removed)</w:t>
+        <w:t>2.4 IDD Text Compliance — Misleading Claims Removed</w:t>
       </w:r>
     </w:p>
     <w:p>
       <w:r>
-        <w:t>Per IDD non-misleading requirements, the following text was changed across all pages (English + Greek):</w:t>
+        <w:t>Per IDD (Insurance Distribution Directive) non-misleading requirements, all absolute, unsubstantiated, or time-specific claims were replaced with compliant wording across all pages in both languages:</w:t>
       </w:r>
     </w:p>
     <w:tbl>
@@ -233,13 +852,14 @@
         <w:tblLook w:firstColumn="1" w:firstRow="1" w:lastColumn="0" w:lastRow="0" w:noHBand="0" w:noVBand="1" w:val="04A0"/>
       </w:tblPr>
       <w:tblGrid>
-        <w:gridCol w:w="4320"/>
-        <w:gridCol w:w="4320"/>
+        <w:gridCol w:w="2880"/>
+        <w:gridCol w:w="2880"/>
+        <w:gridCol w:w="2880"/>
       </w:tblGrid>
       <w:tr>
         <w:tc>
           <w:tcPr>
-            <w:tcW w:type="dxa" w:w="4320"/>
+            <w:tcW w:type="dxa" w:w="2880"/>
           </w:tcPr>
           <w:p>
             <w:r>
@@ -252,7 +872,7 @@
         </w:tc>
         <w:tc>
           <w:tcPr>
-            <w:tcW w:type="dxa" w:w="4320"/>
+            <w:tcW w:type="dxa" w:w="2880"/>
           </w:tcPr>
           <w:p>
             <w:r>
@@ -263,11 +883,24 @@
             </w:r>
           </w:p>
         </w:tc>
+        <w:tc>
+          <w:tcPr>
+            <w:tcW w:type="dxa" w:w="2880"/>
+          </w:tcPr>
+          <w:p>
+            <w:r>
+              <w:rPr>
+                <w:b/>
+              </w:rPr>
+              <w:t>Reason</w:t>
+            </w:r>
+          </w:p>
+        </w:tc>
       </w:tr>
       <w:tr>
         <w:tc>
           <w:tcPr>
-            <w:tcW w:type="dxa" w:w="4320"/>
+            <w:tcW w:type="dxa" w:w="2880"/>
           </w:tcPr>
           <w:p>
             <w:r>
@@ -277,7 +910,7 @@
         </w:tc>
         <w:tc>
           <w:tcPr>
-            <w:tcW w:type="dxa" w:w="4320"/>
+            <w:tcW w:type="dxa" w:w="2880"/>
           </w:tcPr>
           <w:p>
             <w:r>
@@ -285,11 +918,53 @@
             </w:r>
           </w:p>
         </w:tc>
+        <w:tc>
+          <w:tcPr>
+            <w:tcW w:type="dxa" w:w="2880"/>
+          </w:tcPr>
+          <w:p>
+            <w:r>
+              <w:t>Absolute guarantee claim</w:t>
+            </w:r>
+          </w:p>
+        </w:tc>
       </w:tr>
       <w:tr>
         <w:tc>
           <w:tcPr>
-            <w:tcW w:type="dxa" w:w="4320"/>
+            <w:tcW w:type="dxa" w:w="2880"/>
+          </w:tcPr>
+          <w:p>
+            <w:r>
+              <w:t>"Σαφήνεια και Κάλυψη, Εγγυημένα"</w:t>
+            </w:r>
+          </w:p>
+        </w:tc>
+        <w:tc>
+          <w:tcPr>
+            <w:tcW w:type="dxa" w:w="2880"/>
+          </w:tcPr>
+          <w:p>
+            <w:r>
+              <w:t>"Σαφήνεια και Κάλυψη, Εξασφαλισμένα"</w:t>
+            </w:r>
+          </w:p>
+        </w:tc>
+        <w:tc>
+          <w:tcPr>
+            <w:tcW w:type="dxa" w:w="2880"/>
+          </w:tcPr>
+          <w:p>
+            <w:r>
+              <w:t>Greek equivalent</w:t>
+            </w:r>
+          </w:p>
+        </w:tc>
+      </w:tr>
+      <w:tr>
+        <w:tc>
+          <w:tcPr>
+            <w:tcW w:type="dxa" w:w="2880"/>
           </w:tcPr>
           <w:p>
             <w:r>
@@ -299,7 +974,7 @@
         </w:tc>
         <w:tc>
           <w:tcPr>
-            <w:tcW w:type="dxa" w:w="4320"/>
+            <w:tcW w:type="dxa" w:w="2880"/>
           </w:tcPr>
           <w:p>
             <w:r>
@@ -307,11 +982,21 @@
             </w:r>
           </w:p>
         </w:tc>
+        <w:tc>
+          <w:tcPr>
+            <w:tcW w:type="dxa" w:w="2880"/>
+          </w:tcPr>
+          <w:p>
+            <w:r>
+              <w:t>Unsubstantiated metric</w:t>
+            </w:r>
+          </w:p>
+        </w:tc>
       </w:tr>
       <w:tr>
         <w:tc>
           <w:tcPr>
-            <w:tcW w:type="dxa" w:w="4320"/>
+            <w:tcW w:type="dxa" w:w="2880"/>
           </w:tcPr>
           <w:p>
             <w:r>
@@ -321,7 +1006,7 @@
         </w:tc>
         <w:tc>
           <w:tcPr>
-            <w:tcW w:type="dxa" w:w="4320"/>
+            <w:tcW w:type="dxa" w:w="2880"/>
           </w:tcPr>
           <w:p>
             <w:r>
@@ -329,11 +1014,21 @@
             </w:r>
           </w:p>
         </w:tc>
+        <w:tc>
+          <w:tcPr>
+            <w:tcW w:type="dxa" w:w="2880"/>
+          </w:tcPr>
+          <w:p>
+            <w:r>
+              <w:t>Specific time commitment</w:t>
+            </w:r>
+          </w:p>
+        </w:tc>
       </w:tr>
       <w:tr>
         <w:tc>
           <w:tcPr>
-            <w:tcW w:type="dxa" w:w="4320"/>
+            <w:tcW w:type="dxa" w:w="2880"/>
           </w:tcPr>
           <w:p>
             <w:r>
@@ -343,7 +1038,7 @@
         </w:tc>
         <w:tc>
           <w:tcPr>
-            <w:tcW w:type="dxa" w:w="4320"/>
+            <w:tcW w:type="dxa" w:w="2880"/>
           </w:tcPr>
           <w:p>
             <w:r>
@@ -351,25 +1046,13 @@
             </w:r>
           </w:p>
         </w:tc>
-      </w:tr>
-      <w:tr>
         <w:tc>
           <w:tcPr>
-            <w:tcW w:type="dxa" w:w="4320"/>
+            <w:tcW w:type="dxa" w:w="2880"/>
           </w:tcPr>
           <w:p>
             <w:r>
-              <w:t>"Up to 30% discount for families"</w:t>
-            </w:r>
-          </w:p>
-        </w:tc>
-        <w:tc>
-          <w:tcPr>
-            <w:tcW w:type="dxa" w:w="4320"/>
-          </w:tcPr>
-          <w:p>
-            <w:r>
-              <w:t>"Family discounts available on eligible plans"</w:t>
+              <w:t>Unsubstantiated savings claim</w:t>
             </w:r>
           </w:p>
         </w:tc>
@@ -377,21 +1060,31 @@
       <w:tr>
         <w:tc>
           <w:tcPr>
-            <w:tcW w:type="dxa" w:w="4320"/>
+            <w:tcW w:type="dxa" w:w="2880"/>
           </w:tcPr>
           <w:p>
             <w:r>
-              <w:t>"10-20% discount with security systems"</w:t>
+              <w:t>"Up to 30% family discount"</w:t>
             </w:r>
           </w:p>
         </w:tc>
         <w:tc>
           <w:tcPr>
-            <w:tcW w:type="dxa" w:w="4320"/>
+            <w:tcW w:type="dxa" w:w="2880"/>
           </w:tcPr>
           <w:p>
             <w:r>
-              <w:t>"Discounts may apply for security systems"</w:t>
+              <w:t>"Family discounts on eligible plans"</w:t>
+            </w:r>
+          </w:p>
+        </w:tc>
+        <w:tc>
+          <w:tcPr>
+            <w:tcW w:type="dxa" w:w="2880"/>
+          </w:tcPr>
+          <w:p>
+            <w:r>
+              <w:t>Specific unverified percentage</w:t>
             </w:r>
           </w:p>
         </w:tc>
@@ -399,7 +1092,39 @@
       <w:tr>
         <w:tc>
           <w:tcPr>
-            <w:tcW w:type="dxa" w:w="4320"/>
+            <w:tcW w:type="dxa" w:w="2880"/>
+          </w:tcPr>
+          <w:p>
+            <w:r>
+              <w:t>"10-20% discount for security"</w:t>
+            </w:r>
+          </w:p>
+        </w:tc>
+        <w:tc>
+          <w:tcPr>
+            <w:tcW w:type="dxa" w:w="2880"/>
+          </w:tcPr>
+          <w:p>
+            <w:r>
+              <w:t>"Discounts may apply for security"</w:t>
+            </w:r>
+          </w:p>
+        </w:tc>
+        <w:tc>
+          <w:tcPr>
+            <w:tcW w:type="dxa" w:w="2880"/>
+          </w:tcPr>
+          <w:p>
+            <w:r>
+              <w:t>Specific unverified percentage</w:t>
+            </w:r>
+          </w:p>
+        </w:tc>
+      </w:tr>
+      <w:tr>
+        <w:tc>
+          <w:tcPr>
+            <w:tcW w:type="dxa" w:w="2880"/>
           </w:tcPr>
           <w:p>
             <w:r>
@@ -409,7 +1134,7 @@
         </w:tc>
         <w:tc>
           <w:tcPr>
-            <w:tcW w:type="dxa" w:w="4320"/>
+            <w:tcW w:type="dxa" w:w="2880"/>
           </w:tcPr>
           <w:p>
             <w:r>
@@ -417,11 +1142,21 @@
             </w:r>
           </w:p>
         </w:tc>
+        <w:tc>
+          <w:tcPr>
+            <w:tcW w:type="dxa" w:w="2880"/>
+          </w:tcPr>
+          <w:p>
+            <w:r>
+              <w:t>Superlative without proof</w:t>
+            </w:r>
+          </w:p>
+        </w:tc>
       </w:tr>
       <w:tr>
         <w:tc>
           <w:tcPr>
-            <w:tcW w:type="dxa" w:w="4320"/>
+            <w:tcW w:type="dxa" w:w="2880"/>
           </w:tcPr>
           <w:p>
             <w:r>
@@ -431,7 +1166,7 @@
         </w:tc>
         <w:tc>
           <w:tcPr>
-            <w:tcW w:type="dxa" w:w="4320"/>
+            <w:tcW w:type="dxa" w:w="2880"/>
           </w:tcPr>
           <w:p>
             <w:r>
@@ -439,11 +1174,21 @@
             </w:r>
           </w:p>
         </w:tc>
+        <w:tc>
+          <w:tcPr>
+            <w:tcW w:type="dxa" w:w="2880"/>
+          </w:tcPr>
+          <w:p>
+            <w:r>
+              <w:t>Absolute negative claim</w:t>
+            </w:r>
+          </w:p>
+        </w:tc>
       </w:tr>
       <w:tr>
         <w:tc>
           <w:tcPr>
-            <w:tcW w:type="dxa" w:w="4320"/>
+            <w:tcW w:type="dxa" w:w="2880"/>
           </w:tcPr>
           <w:p>
             <w:r>
@@ -453,7 +1198,7 @@
         </w:tc>
         <w:tc>
           <w:tcPr>
-            <w:tcW w:type="dxa" w:w="4320"/>
+            <w:tcW w:type="dxa" w:w="2880"/>
           </w:tcPr>
           <w:p>
             <w:r>
@@ -461,11 +1206,21 @@
             </w:r>
           </w:p>
         </w:tc>
+        <w:tc>
+          <w:tcPr>
+            <w:tcW w:type="dxa" w:w="2880"/>
+          </w:tcPr>
+          <w:p>
+            <w:r>
+              <w:t>Misleading "free" without conditions</w:t>
+            </w:r>
+          </w:p>
+        </w:tc>
       </w:tr>
       <w:tr>
         <w:tc>
           <w:tcPr>
-            <w:tcW w:type="dxa" w:w="4320"/>
+            <w:tcW w:type="dxa" w:w="2880"/>
           </w:tcPr>
           <w:p>
             <w:r>
@@ -475,7 +1230,7 @@
         </w:tc>
         <w:tc>
           <w:tcPr>
-            <w:tcW w:type="dxa" w:w="4320"/>
+            <w:tcW w:type="dxa" w:w="2880"/>
           </w:tcPr>
           <w:p>
             <w:r>
@@ -483,25 +1238,13 @@
             </w:r>
           </w:p>
         </w:tc>
-      </w:tr>
-      <w:tr>
         <w:tc>
           <w:tcPr>
-            <w:tcW w:type="dxa" w:w="4320"/>
+            <w:tcW w:type="dxa" w:w="2880"/>
           </w:tcPr>
           <w:p>
             <w:r>
-              <w:t>"within 10 minutes" / "within 48 hours"</w:t>
-            </w:r>
-          </w:p>
-        </w:tc>
-        <w:tc>
-          <w:tcPr>
-            <w:tcW w:type="dxa" w:w="4320"/>
-          </w:tcPr>
-          <w:p>
-            <w:r>
-              <w:t>"as quickly as possible" / "promptly"</w:t>
+              <w:t>"Free" implies no cost for service</w:t>
             </w:r>
           </w:p>
         </w:tc>
@@ -509,7 +1252,71 @@
       <w:tr>
         <w:tc>
           <w:tcPr>
-            <w:tcW w:type="dxa" w:w="4320"/>
+            <w:tcW w:type="dxa" w:w="2880"/>
+          </w:tcPr>
+          <w:p>
+            <w:r>
+              <w:t>"within 10 minutes"</w:t>
+            </w:r>
+          </w:p>
+        </w:tc>
+        <w:tc>
+          <w:tcPr>
+            <w:tcW w:type="dxa" w:w="2880"/>
+          </w:tcPr>
+          <w:p>
+            <w:r>
+              <w:t>"as quickly as possible"</w:t>
+            </w:r>
+          </w:p>
+        </w:tc>
+        <w:tc>
+          <w:tcPr>
+            <w:tcW w:type="dxa" w:w="2880"/>
+          </w:tcPr>
+          <w:p>
+            <w:r>
+              <w:t>Specific time commitment</w:t>
+            </w:r>
+          </w:p>
+        </w:tc>
+      </w:tr>
+      <w:tr>
+        <w:tc>
+          <w:tcPr>
+            <w:tcW w:type="dxa" w:w="2880"/>
+          </w:tcPr>
+          <w:p>
+            <w:r>
+              <w:t>"within 48 hours"</w:t>
+            </w:r>
+          </w:p>
+        </w:tc>
+        <w:tc>
+          <w:tcPr>
+            <w:tcW w:type="dxa" w:w="2880"/>
+          </w:tcPr>
+          <w:p>
+            <w:r>
+              <w:t>"promptly"</w:t>
+            </w:r>
+          </w:p>
+        </w:tc>
+        <w:tc>
+          <w:tcPr>
+            <w:tcW w:type="dxa" w:w="2880"/>
+          </w:tcPr>
+          <w:p>
+            <w:r>
+              <w:t>Specific time commitment</w:t>
+            </w:r>
+          </w:p>
+        </w:tc>
+      </w:tr>
+      <w:tr>
+        <w:tc>
+          <w:tcPr>
+            <w:tcW w:type="dxa" w:w="2880"/>
           </w:tcPr>
           <w:p>
             <w:r>
@@ -519,11 +1326,21 @@
         </w:tc>
         <w:tc>
           <w:tcPr>
-            <w:tcW w:type="dxa" w:w="4320"/>
+            <w:tcW w:type="dxa" w:w="2880"/>
           </w:tcPr>
           <w:p>
             <w:r>
-              <w:t>"that fits your needs" / "tailored to your needs"</w:t>
+              <w:t>"that fits your needs"</w:t>
+            </w:r>
+          </w:p>
+        </w:tc>
+        <w:tc>
+          <w:tcPr>
+            <w:tcW w:type="dxa" w:w="2880"/>
+          </w:tcPr>
+          <w:p>
+            <w:r>
+              <w:t>Negative comparison language</w:t>
             </w:r>
           </w:p>
         </w:tc>
@@ -535,6 +1352,11 @@
       </w:pPr>
       <w:r>
         <w:t>2.5 Footer Updates (all 18 pages)</w:t>
+      </w:r>
+    </w:p>
+    <w:p>
+      <w:r>
+        <w:t>Added to every page footer:</w:t>
       </w:r>
     </w:p>
     <w:p>
@@ -550,7 +1372,15 @@
         <w:pStyle w:val="ListBullet"/>
       </w:pPr>
       <w:r>
-        <w:t>AI chatbot disclosure: "Our chat assistant is AI-powered" with robot icon (EN + EL)</w:t>
+        <w:t>AI chatbot disclosure: "Our chat assistant is AI-powered" / "Ο βοηθός συνομιλίας μας λειτουργεί με τεχνητή νοημοσύνη"</w:t>
+      </w:r>
+    </w:p>
+    <w:p>
+      <w:pPr>
+        <w:pStyle w:val="ListBullet"/>
+      </w:pPr>
+      <w:r>
+        <w:t>Cookie Settings link opens CMP modal (does not navigate to a new page)</w:t>
       </w:r>
     </w:p>
     <w:p>
@@ -558,7 +1388,12 @@
         <w:pStyle w:val="Heading2"/>
       </w:pPr>
       <w:r>
-        <w:t>2.6 Video Performance (main.html + EL/main.html)</w:t>
+        <w:t>2.6 Video Performance</w:t>
+      </w:r>
+    </w:p>
+    <w:p>
+      <w:r>
+        <w:t>Changes to main.html and EL/main.html:</w:t>
       </w:r>
     </w:p>
     <w:p>
@@ -566,7 +1401,7 @@
         <w:pStyle w:val="ListBullet"/>
       </w:pPr>
       <w:r>
-        <w:t>Changed preload="auto" to preload="none" — prevents auto-downloading the full video</w:t>
+        <w:t>preload="auto" → preload="none": prevents browser from downloading the full video file on page load, saving bandwidth</w:t>
       </w:r>
     </w:p>
     <w:p>
@@ -574,7 +1409,7 @@
         <w:pStyle w:val="ListBullet"/>
       </w:pPr>
       <w:r>
-        <w:t>Generated poster image from actual video frame for immediate visual content</w:t>
+        <w:t>Added poster image (assets/img/video_poster.jpg): extracted from actual video frame 30 at 1280×720, JPEG quality 85. Shows immediately while video loads.</w:t>
       </w:r>
     </w:p>
     <w:p>
@@ -582,7 +1417,12 @@
         <w:pStyle w:val="Heading2"/>
       </w:pPr>
       <w:r>
-        <w:t>2.7 Accessibility — Reduced Motion</w:t>
+        <w:t>2.7 Accessibility</w:t>
+      </w:r>
+    </w:p>
+    <w:p>
+      <w:r>
+        <w:t>prefers-reduced-motion support:</w:t>
       </w:r>
     </w:p>
     <w:p>
@@ -590,7 +1430,7 @@
         <w:pStyle w:val="ListBullet"/>
       </w:pPr>
       <w:r>
-        <w:t>CSS: prefers-reduced-motion media query disables all animations for users who enable "Reduce motion" in OS settings</w:t>
+        <w:t>CSS media query in main.css and sub.css: disables all CSS animations, transitions, AOS scroll effects, and Swiper autoplay when user has "Reduce motion" enabled in their OS accessibility settings</w:t>
       </w:r>
     </w:p>
     <w:p>
@@ -598,7 +1438,15 @@
         <w:pStyle w:val="ListBullet"/>
       </w:pPr>
       <w:r>
-        <w:t>JavaScript: Auto-pauses the hero video for reduced-motion users</w:t>
+        <w:t>JavaScript in main.html + EL/main.html: auto-pauses the hero background video and removes autoplay for reduced-motion users</w:t>
+      </w:r>
+    </w:p>
+    <w:p>
+      <w:pPr>
+        <w:pStyle w:val="ListBullet"/>
+      </w:pPr>
+      <w:r>
+        <w:t>Corrected image alt text: health, home, and business pages previously had "3D Car" and "Car insurance image" (copy-paste error). Now correctly describe each page's content.</w:t>
       </w:r>
     </w:p>
     <w:p>
@@ -610,11 +1458,49 @@
       </w:r>
     </w:p>
     <w:p>
+      <w:r>
+        <w:rPr>
+          <w:b/>
+        </w:rPr>
+        <w:t xml:space="preserve">XSS Prevention: </w:t>
+      </w:r>
+      <w:r>
+        <w:t>Form error messages in validate.js changed from innerHTML (which executes HTML/JavaScript) to textContent (which treats everything as plain text). Prevents code injection via server error responses.</w:t>
+      </w:r>
+    </w:p>
+    <w:p>
+      <w:r>
+        <w:rPr>
+          <w:b/>
+        </w:rPr>
+        <w:t xml:space="preserve">Security Headers: </w:t>
+      </w:r>
+      <w:r>
+        <w:t>X-Content-Type-Options: nosniff (prevents browsers from guessing file types) and Referrer-Policy: strict-origin-when-cross-origin (limits URL info shared with external sites) added to all 18 pages via meta tags.</w:t>
+      </w:r>
+    </w:p>
+    <w:p>
+      <w:r>
+        <w:rPr>
+          <w:b/>
+        </w:rPr>
+        <w:t xml:space="preserve">Cookie Display: </w:t>
+      </w:r>
+      <w:r>
+        <w:t>Fixed cookie name colour in cookie-policy.html to be visible in both light mode (dark grey #333) and dark mode (gold #e0c882).</w:t>
+      </w:r>
+    </w:p>
+    <w:p>
       <w:pPr>
-        <w:pStyle w:val="ListBullet"/>
+        <w:pStyle w:val="Heading2"/>
       </w:pPr>
       <w:r>
-        <w:t>XSS fix: Form error messages now use textContent instead of innerHTML (prevents code injection)</w:t>
+        <w:t>2.9 Navigation &amp; Language Consistency</w:t>
+      </w:r>
+    </w:p>
+    <w:p>
+      <w:r>
+        <w:t>All legal pages were audited against existing pages for consistency:</w:t>
       </w:r>
     </w:p>
     <w:p>
@@ -622,7 +1508,7 @@
         <w:pStyle w:val="ListBullet"/>
       </w:pPr>
       <w:r>
-        <w:t>Security headers: X-Content-Type-Options (nosniff) and Referrer-Policy added to all 18 pages</w:t>
+        <w:t>Language switcher: EN legal pages link directly to their EL counterpart (e.g. privacy-policy.html → EL/privacy-policy.html), and vice versa</w:t>
       </w:r>
     </w:p>
     <w:p>
@@ -630,7 +1516,7 @@
         <w:pStyle w:val="ListBullet"/>
       </w:pPr>
       <w:r>
-        <w:t>Cookie code color: Fixed for visibility in both light and dark mode</w:t>
+        <w:t>Greek nav labels matched to existing pages: "Σχετικά με τον Άντρο" (not "Ο Andros"), "Ασφάλεια Επιχειρήσεων" (not "Επαγγελματική Ασφάλιση"), "Συχνές Ερωτήσεις" (not "FAQ")</w:t>
       </w:r>
     </w:p>
     <w:p>
@@ -638,7 +1524,23 @@
         <w:pStyle w:val="ListBullet"/>
       </w:pPr>
       <w:r>
-        <w:t>Image alt text: Corrected wrong alt attributes on health, home, and business pages</w:t>
+        <w:t>Footer "Useful Links" section matches existing pages: Home + Contact only (no extra About/Services links)</w:t>
+      </w:r>
+    </w:p>
+    <w:p>
+      <w:pPr>
+        <w:pStyle w:val="ListBullet"/>
+      </w:pPr>
+      <w:r>
+        <w:t>Footer "Services" heading: "Οι Υπηρεσίες Μας" (capitalised, matching reference)</w:t>
+      </w:r>
+    </w:p>
+    <w:p>
+      <w:pPr>
+        <w:pStyle w:val="ListBullet"/>
+      </w:pPr>
+      <w:r>
+        <w:t>Footer service labels: "Ασφάλεια" (not "Ασφάλιση") for consistency</w:t>
       </w:r>
     </w:p>
     <w:p>
@@ -646,7 +1548,7 @@
         <w:pStyle w:val="Heading2"/>
       </w:pPr>
       <w:r>
-        <w:t>2.9 SEO &amp; Technical Files</w:t>
+        <w:t>2.10 SEO &amp; Technical Files</w:t>
       </w:r>
     </w:p>
     <w:p>
@@ -654,7 +1556,7 @@
         <w:pStyle w:val="ListBullet"/>
       </w:pPr>
       <w:r>
-        <w:t>robots.txt — Blocks /forms/ and /consent-worker/ from search engines</w:t>
+        <w:t>robots.txt: Allows all pages, blocks /forms/ and /consent-worker/ directories from search engines. Includes sitemap reference.</w:t>
       </w:r>
     </w:p>
     <w:p>
@@ -662,7 +1564,7 @@
         <w:pStyle w:val="ListBullet"/>
       </w:pPr>
       <w:r>
-        <w:t>sitemap.xml — Lists all 18 pages for search engine indexing</w:t>
+        <w:t>sitemap.xml: Lists all 18 HTML pages with priority values (1.0 for main pages, 0.9 for product pages, 0.3 for legal pages). Domain placeholder: eacinsurance.com (update when domain confirmed).</w:t>
       </w:r>
     </w:p>
     <w:p>
@@ -670,65 +1572,12 @@
         <w:pStyle w:val="Heading1"/>
       </w:pPr>
       <w:r>
-        <w:t>3. Technical Approach</w:t>
+        <w:t>3. Verification Results</w:t>
       </w:r>
     </w:p>
     <w:p>
       <w:r>
-        <w:t>All changes were made with zero impact on existing functionality:</w:t>
-      </w:r>
-    </w:p>
-    <w:p>
-      <w:pPr>
-        <w:pStyle w:val="ListBullet"/>
-      </w:pPr>
-      <w:r>
-        <w:t>New legal pages use the same HTML shell as existing pages (same header, nav, footer, scripts)</w:t>
-      </w:r>
-    </w:p>
-    <w:p>
-      <w:pPr>
-        <w:pStyle w:val="ListBullet"/>
-      </w:pPr>
-      <w:r>
-        <w:t>All styles use CSS variables — automatic dark mode compatibility, no extra code needed</w:t>
-      </w:r>
-    </w:p>
-    <w:p>
-      <w:pPr>
-        <w:pStyle w:val="ListBullet"/>
-      </w:pPr>
-      <w:r>
-        <w:t>CMP is a standalone script — no dependencies, no conflicts with existing JavaScript</w:t>
-      </w:r>
-    </w:p>
-    <w:p>
-      <w:pPr>
-        <w:pStyle w:val="ListBullet"/>
-      </w:pPr>
-      <w:r>
-        <w:t>Text replacements were surgical — only the specific problematic phrases were changed</w:t>
-      </w:r>
-    </w:p>
-    <w:p>
-      <w:pPr>
-        <w:pStyle w:val="ListBullet"/>
-      </w:pPr>
-      <w:r>
-        <w:t>Both EN and EL pages were updated simultaneously to maintain language parity</w:t>
-      </w:r>
-    </w:p>
-    <w:p>
-      <w:pPr>
-        <w:pStyle w:val="Heading1"/>
-      </w:pPr>
-      <w:r>
-        <w:t>4. Verification Results</w:t>
-      </w:r>
-    </w:p>
-    <w:p>
-      <w:r>
-        <w:t>All 13 automated checks passed:</w:t>
+        <w:t>All automated checks passed on 25 March 2026:</w:t>
       </w:r>
     </w:p>
     <w:tbl>
@@ -820,7 +1669,7 @@
           </w:tcPr>
           <w:p>
             <w:r>
-              <w:t>Footer legal links (5) on all 18 pages</w:t>
+              <w:t>Footer: 5 legal links on all 18 pages</w:t>
             </w:r>
           </w:p>
         </w:tc>
@@ -842,7 +1691,7 @@
           </w:tcPr>
           <w:p>
             <w:r>
-              <w:t>AI chatbot disclosure on all 10 main pages</w:t>
+              <w:t>CMP script + Cookie Settings onclick on all 18 pages</w:t>
             </w:r>
           </w:p>
         </w:tc>
@@ -864,7 +1713,7 @@
           </w:tcPr>
           <w:p>
             <w:r>
-              <w:t>CMP script on all 18 pages</w:t>
+              <w:t>Zero banned text patterns (17 patterns checked)</w:t>
             </w:r>
           </w:p>
         </w:tc>
@@ -886,7 +1735,7 @@
           </w:tcPr>
           <w:p>
             <w:r>
-              <w:t>Zero banned text patterns (17 patterns)</w:t>
+              <w:t>Language switcher links resolve correctly (all 8 legal pages)</w:t>
             </w:r>
           </w:p>
         </w:tc>
@@ -908,7 +1757,7 @@
           </w:tcPr>
           <w:p>
             <w:r>
-              <w:t>Video: preload, poster, reduced-motion</w:t>
+              <w:t>Nav text consistent with existing pages (all EL legal pages)</w:t>
             </w:r>
           </w:p>
         </w:tc>
@@ -930,117 +1779,7 @@
           </w:tcPr>
           <w:p>
             <w:r>
-              <w:t>Reduced motion CSS in both stylesheets</w:t>
-            </w:r>
-          </w:p>
-        </w:tc>
-        <w:tc>
-          <w:tcPr>
-            <w:tcW w:type="dxa" w:w="4320"/>
-          </w:tcPr>
-          <w:p>
-            <w:r>
-              <w:t>✓ Pass</w:t>
-            </w:r>
-          </w:p>
-        </w:tc>
-      </w:tr>
-      <w:tr>
-        <w:tc>
-          <w:tcPr>
-            <w:tcW w:type="dxa" w:w="4320"/>
-          </w:tcPr>
-          <w:p>
-            <w:r>
-              <w:t>Cookie table populated (not placeholder)</w:t>
-            </w:r>
-          </w:p>
-        </w:tc>
-        <w:tc>
-          <w:tcPr>
-            <w:tcW w:type="dxa" w:w="4320"/>
-          </w:tcPr>
-          <w:p>
-            <w:r>
-              <w:t>✓ Pass</w:t>
-            </w:r>
-          </w:p>
-        </w:tc>
-      </w:tr>
-      <w:tr>
-        <w:tc>
-          <w:tcPr>
-            <w:tcW w:type="dxa" w:w="4320"/>
-          </w:tcPr>
-          <w:p>
-            <w:r>
-              <w:t>XSS fix verified (textContent, no innerHTML)</w:t>
-            </w:r>
-          </w:p>
-        </w:tc>
-        <w:tc>
-          <w:tcPr>
-            <w:tcW w:type="dxa" w:w="4320"/>
-          </w:tcPr>
-          <w:p>
-            <w:r>
-              <w:t>✓ Pass</w:t>
-            </w:r>
-          </w:p>
-        </w:tc>
-      </w:tr>
-      <w:tr>
-        <w:tc>
-          <w:tcPr>
-            <w:tcW w:type="dxa" w:w="4320"/>
-          </w:tcPr>
-          <w:p>
-            <w:r>
-              <w:t>Consent worker responds (HTTP 200)</w:t>
-            </w:r>
-          </w:p>
-        </w:tc>
-        <w:tc>
-          <w:tcPr>
-            <w:tcW w:type="dxa" w:w="4320"/>
-          </w:tcPr>
-          <w:p>
-            <w:r>
-              <w:t>✓ Pass</w:t>
-            </w:r>
-          </w:p>
-        </w:tc>
-      </w:tr>
-      <w:tr>
-        <w:tc>
-          <w:tcPr>
-            <w:tcW w:type="dxa" w:w="4320"/>
-          </w:tcPr>
-          <w:p>
-            <w:r>
-              <w:t>robots.txt present</w:t>
-            </w:r>
-          </w:p>
-        </w:tc>
-        <w:tc>
-          <w:tcPr>
-            <w:tcW w:type="dxa" w:w="4320"/>
-          </w:tcPr>
-          <w:p>
-            <w:r>
-              <w:t>✓ Pass</w:t>
-            </w:r>
-          </w:p>
-        </w:tc>
-      </w:tr>
-      <w:tr>
-        <w:tc>
-          <w:tcPr>
-            <w:tcW w:type="dxa" w:w="4320"/>
-          </w:tcPr>
-          <w:p>
-            <w:r>
-              <w:t>sitemap.xml with 18 URLs</w:t>
+              <w:t>Footer structure matches reference (2 useful links, correct headings)</w:t>
             </w:r>
           </w:p>
         </w:tc>
@@ -1061,12 +1800,220 @@
         <w:pStyle w:val="Heading1"/>
       </w:pPr>
       <w:r>
-        <w:t>5. Remaining Items (CEO Action Required)</w:t>
+        <w:t>4. Complete File List</w:t>
+      </w:r>
+    </w:p>
+    <w:p>
+      <w:pPr>
+        <w:pStyle w:val="Heading2"/>
+      </w:pPr>
+      <w:r>
+        <w:t>New Files Created</w:t>
+      </w:r>
+    </w:p>
+    <w:p>
+      <w:pPr>
+        <w:pStyle w:val="ListBullet"/>
+      </w:pPr>
+      <w:r>
+        <w:t>privacy-policy.html — EN Privacy Policy</w:t>
+      </w:r>
+    </w:p>
+    <w:p>
+      <w:pPr>
+        <w:pStyle w:val="ListBullet"/>
+      </w:pPr>
+      <w:r>
+        <w:t>EL/privacy-policy.html — EL Privacy Policy</w:t>
+      </w:r>
+    </w:p>
+    <w:p>
+      <w:pPr>
+        <w:pStyle w:val="ListBullet"/>
+      </w:pPr>
+      <w:r>
+        <w:t>cookie-policy.html — EN Cookie Policy</w:t>
+      </w:r>
+    </w:p>
+    <w:p>
+      <w:pPr>
+        <w:pStyle w:val="ListBullet"/>
+      </w:pPr>
+      <w:r>
+        <w:t>EL/cookie-policy.html — EL Cookie Policy</w:t>
+      </w:r>
+    </w:p>
+    <w:p>
+      <w:pPr>
+        <w:pStyle w:val="ListBullet"/>
+      </w:pPr>
+      <w:r>
+        <w:t>disclosures.html — EN Disclosures / IIID</w:t>
+      </w:r>
+    </w:p>
+    <w:p>
+      <w:pPr>
+        <w:pStyle w:val="ListBullet"/>
+      </w:pPr>
+      <w:r>
+        <w:t>EL/disclosures.html — EL Disclosures / IIID</w:t>
+      </w:r>
+    </w:p>
+    <w:p>
+      <w:pPr>
+        <w:pStyle w:val="ListBullet"/>
+      </w:pPr>
+      <w:r>
+        <w:t>terms.html — EN Terms &amp; Conditions</w:t>
+      </w:r>
+    </w:p>
+    <w:p>
+      <w:pPr>
+        <w:pStyle w:val="ListBullet"/>
+      </w:pPr>
+      <w:r>
+        <w:t>EL/terms.html — EL Terms &amp; Conditions</w:t>
+      </w:r>
+    </w:p>
+    <w:p>
+      <w:pPr>
+        <w:pStyle w:val="ListBullet"/>
+      </w:pPr>
+      <w:r>
+        <w:t>assets/js/cmp.js — Cookie Consent Management Platform script</w:t>
+      </w:r>
+    </w:p>
+    <w:p>
+      <w:pPr>
+        <w:pStyle w:val="ListBullet"/>
+      </w:pPr>
+      <w:r>
+        <w:t>assets/img/video_poster.jpg — Video poster image (extracted from video)</w:t>
+      </w:r>
+    </w:p>
+    <w:p>
+      <w:pPr>
+        <w:pStyle w:val="ListBullet"/>
+      </w:pPr>
+      <w:r>
+        <w:t>consent-worker/worker.js — Cloudflare Worker for consent logging</w:t>
+      </w:r>
+    </w:p>
+    <w:p>
+      <w:pPr>
+        <w:pStyle w:val="ListBullet"/>
+      </w:pPr>
+      <w:r>
+        <w:t>consent-worker/wrangler.toml — Worker deployment configuration</w:t>
+      </w:r>
+    </w:p>
+    <w:p>
+      <w:pPr>
+        <w:pStyle w:val="ListBullet"/>
+      </w:pPr>
+      <w:r>
+        <w:t>robots.txt — Search engine crawling directives</w:t>
+      </w:r>
+    </w:p>
+    <w:p>
+      <w:pPr>
+        <w:pStyle w:val="ListBullet"/>
+      </w:pPr>
+      <w:r>
+        <w:t>sitemap.xml — Sitemap with 18 URLs</w:t>
+      </w:r>
+    </w:p>
+    <w:p>
+      <w:pPr>
+        <w:pStyle w:val="Heading2"/>
+      </w:pPr>
+      <w:r>
+        <w:t>Modified Files</w:t>
+      </w:r>
+    </w:p>
+    <w:p>
+      <w:pPr>
+        <w:pStyle w:val="ListBullet"/>
+      </w:pPr>
+      <w:r>
+        <w:t>main.html + EL/main.html — CMP, footer links, AI disclosure, claims text, video poster/preload, reduced motion JS, security headers, stats section</w:t>
+      </w:r>
+    </w:p>
+    <w:p>
+      <w:pPr>
+        <w:pStyle w:val="ListBullet"/>
+      </w:pPr>
+      <w:r>
+        <w:t>motor.html + EL/motor.html — CMP, footer links, AI disclosure, claims text, alt text fix, security headers</w:t>
+      </w:r>
+    </w:p>
+    <w:p>
+      <w:pPr>
+        <w:pStyle w:val="ListBullet"/>
+      </w:pPr>
+      <w:r>
+        <w:t>health.html + EL/health.html — CMP, footer links, AI disclosure, claims text, alt text fix, security headers</w:t>
+      </w:r>
+    </w:p>
+    <w:p>
+      <w:pPr>
+        <w:pStyle w:val="ListBullet"/>
+      </w:pPr>
+      <w:r>
+        <w:t>home.html + EL/home.html — CMP, footer links, AI disclosure, claims text, alt text fix, security headers</w:t>
+      </w:r>
+    </w:p>
+    <w:p>
+      <w:pPr>
+        <w:pStyle w:val="ListBullet"/>
+      </w:pPr>
+      <w:r>
+        <w:t>business.html + EL/business.html — CMP, footer links, AI disclosure, claims text, alt text fix, security headers</w:t>
+      </w:r>
+    </w:p>
+    <w:p>
+      <w:pPr>
+        <w:pStyle w:val="ListBullet"/>
+      </w:pPr>
+      <w:r>
+        <w:t>assets/css/main.css — CMP banner/modal styles, legal page content styles, reduced motion media query, footer legal links</w:t>
+      </w:r>
+    </w:p>
+    <w:p>
+      <w:pPr>
+        <w:pStyle w:val="ListBullet"/>
+      </w:pPr>
+      <w:r>
+        <w:t>assets/css/sub.css — Same CSS additions + cookie code colour fix for dark/light mode</w:t>
+      </w:r>
+    </w:p>
+    <w:p>
+      <w:pPr>
+        <w:pStyle w:val="ListBullet"/>
+      </w:pPr>
+      <w:r>
+        <w:t>assets/vendor/php-email-form/validate.js — XSS fix (innerHTML → textContent)</w:t>
+      </w:r>
+    </w:p>
+    <w:p>
+      <w:pPr>
+        <w:pStyle w:val="Heading1"/>
+      </w:pPr>
+      <w:r>
+        <w:t>5. Remaining Items — CEO Action Required</w:t>
+      </w:r>
+    </w:p>
+    <w:p>
+      <w:pPr>
+        <w:pStyle w:val="Heading2"/>
+      </w:pPr>
+      <w:r>
+        <w:t>5.1 Disclosures Page Placeholders</w:t>
       </w:r>
     </w:p>
     <w:p>
       <w:r>
-        <w:t>Three placeholders in the Disclosures page (disclosures.html + EL/disclosures.html) require regulatory information that only the CEO can provide:</w:t>
+        <w:t>Three placeholders in disclosures.html and EL/disclosures.html require regulatory information that only the CEO (Andros) can provide:</w:t>
       </w:r>
     </w:p>
     <w:tbl>
@@ -1090,7 +2037,7 @@
               <w:rPr>
                 <w:b/>
               </w:rPr>
-              <w:t>Placeholder</w:t>
+              <w:t>Item</w:t>
             </w:r>
           </w:p>
         </w:tc>
@@ -1116,7 +2063,7 @@
               <w:rPr>
                 <w:b/>
               </w:rPr>
-              <w:t>Where</w:t>
+              <w:t>Location</w:t>
             </w:r>
           </w:p>
         </w:tc>
@@ -1128,7 +2075,7 @@
           </w:tcPr>
           <w:p>
             <w:r>
-              <w:t>Licence category</w:t>
+              <w:t>Licence Category</w:t>
             </w:r>
           </w:p>
         </w:tc>
@@ -1138,7 +2085,7 @@
           </w:tcPr>
           <w:p>
             <w:r>
-              <w:t>Is E.A.C. an insurance agent, broker, or ancillary intermediary?</w:t>
+              <w:t>Is E.A.C. an insurance agent, broker, or ancillary intermediary? (exact ICCS licence type)</w:t>
             </w:r>
           </w:p>
         </w:tc>
@@ -1160,7 +2107,7 @@
           </w:tcPr>
           <w:p>
             <w:r>
-              <w:t>Registration number</w:t>
+              <w:t>Registration Number</w:t>
             </w:r>
           </w:p>
         </w:tc>
@@ -1170,7 +2117,7 @@
           </w:tcPr>
           <w:p>
             <w:r>
-              <w:t>ICCS registration number</w:t>
+              <w:t>E.A.C.'s ICCS (Insurance Companies Control Service) registration number</w:t>
             </w:r>
           </w:p>
         </w:tc>
@@ -1192,7 +2139,7 @@
           </w:tcPr>
           <w:p>
             <w:r>
-              <w:t>Advice disclosure</w:t>
+              <w:t>Advice Disclosure</w:t>
             </w:r>
           </w:p>
         </w:tc>
@@ -1202,7 +2149,7 @@
           </w:tcPr>
           <w:p>
             <w:r>
-              <w:t>Does E.A.C. provide advice on insurance products? (yes/no)</w:t>
+              <w:t>Does E.A.C. provide advice on insurance products, or only information? (yes/no)</w:t>
             </w:r>
           </w:p>
         </w:tc>
@@ -1221,7 +2168,20 @@
     <w:p/>
     <w:p>
       <w:r>
-        <w:t>Once these values are provided, they will be updated in both the English and Greek versions. No other changes are needed for go-live.</w:t>
+        <w:t>Once provided, these will be updated in both English and Greek versions. This is the only remaining blocker for full IDD compliance.</w:t>
+      </w:r>
+    </w:p>
+    <w:p>
+      <w:pPr>
+        <w:pStyle w:val="Heading2"/>
+      </w:pPr>
+      <w:r>
+        <w:t>5.2 WhatsApp Business Chatbot</w:t>
+      </w:r>
+    </w:p>
+    <w:p>
+      <w:r>
+        <w:t>See separate document: WhatsApp_Bot_Requirements.docx</w:t>
       </w:r>
     </w:p>
     <w:p>
@@ -1229,230 +2189,291 @@
         <w:pStyle w:val="Heading1"/>
       </w:pPr>
       <w:r>
-        <w:t>6. Production Checklist (Before Going Live)</w:t>
+        <w:t>6. Production Checklist — Before Going Live</w:t>
       </w:r>
     </w:p>
     <w:p>
       <w:r>
-        <w:t>Once a domain is chosen and hosting is set up:</w:t>
+        <w:t>Once a domain is chosen and hosting is configured:</w:t>
       </w:r>
     </w:p>
-    <w:p>
-      <w:pPr>
-        <w:pStyle w:val="ListBullet"/>
-      </w:pPr>
-      <w:r>
-        <w:t>Update CORS in consent worker from wildcard (*) to your production domain</w:t>
-      </w:r>
-    </w:p>
-    <w:p>
-      <w:pPr>
-        <w:pStyle w:val="ListBullet"/>
-      </w:pPr>
-      <w:r>
-        <w:t>Update sitemap.xml domain from eacinsurance.com to your actual domain</w:t>
-      </w:r>
-    </w:p>
-    <w:p>
-      <w:pPr>
-        <w:pStyle w:val="ListBullet"/>
-      </w:pPr>
-      <w:r>
-        <w:t>Update robots.txt Sitemap URL to your actual domain</w:t>
-      </w:r>
-    </w:p>
-    <w:p>
-      <w:pPr>
-        <w:pStyle w:val="ListBullet"/>
-      </w:pPr>
-      <w:r>
-        <w:t>Redeploy the Cloudflare Worker if domain changes: npx wrangler deploy</w:t>
-      </w:r>
-    </w:p>
-    <w:p>
-      <w:pPr>
-        <w:pStyle w:val="ListBullet"/>
-      </w:pPr>
-      <w:r>
-        <w:t>Submit sitemap to Google Search Console</w:t>
-      </w:r>
-    </w:p>
-    <w:p>
-      <w:pPr>
-        <w:pStyle w:val="ListBullet"/>
-      </w:pPr>
-      <w:r>
-        <w:t>Run a final Lighthouse audit for performance scores</w:t>
-      </w:r>
-    </w:p>
-    <w:p>
-      <w:pPr>
-        <w:pStyle w:val="Heading1"/>
-      </w:pPr>
-      <w:r>
-        <w:t>7. Files Summary</w:t>
-      </w:r>
-    </w:p>
-    <w:p>
-      <w:pPr>
-        <w:pStyle w:val="Heading2"/>
-      </w:pPr>
-      <w:r>
-        <w:t>New Files Created (12)</w:t>
-      </w:r>
-    </w:p>
-    <w:p>
-      <w:pPr>
-        <w:pStyle w:val="ListBullet"/>
-      </w:pPr>
-      <w:r>
-        <w:t>privacy-policy.html + EL/privacy-policy.html — Privacy Policy</w:t>
-      </w:r>
-    </w:p>
-    <w:p>
-      <w:pPr>
-        <w:pStyle w:val="ListBullet"/>
-      </w:pPr>
-      <w:r>
-        <w:t>cookie-policy.html + EL/cookie-policy.html — Cookie Policy</w:t>
-      </w:r>
-    </w:p>
-    <w:p>
-      <w:pPr>
-        <w:pStyle w:val="ListBullet"/>
-      </w:pPr>
-      <w:r>
-        <w:t>disclosures.html + EL/disclosures.html — Disclosures / IIID</w:t>
-      </w:r>
-    </w:p>
-    <w:p>
-      <w:pPr>
-        <w:pStyle w:val="ListBullet"/>
-      </w:pPr>
-      <w:r>
-        <w:t>terms.html + EL/terms.html — Terms &amp; Conditions</w:t>
-      </w:r>
-    </w:p>
-    <w:p>
-      <w:pPr>
-        <w:pStyle w:val="ListBullet"/>
-      </w:pPr>
-      <w:r>
-        <w:t>assets/js/cmp.js — Cookie Consent Management script</w:t>
-      </w:r>
-    </w:p>
-    <w:p>
-      <w:pPr>
-        <w:pStyle w:val="ListBullet"/>
-      </w:pPr>
-      <w:r>
-        <w:t>assets/img/video_poster.jpg — Video poster frame</w:t>
-      </w:r>
-    </w:p>
-    <w:p>
-      <w:pPr>
-        <w:pStyle w:val="ListBullet"/>
-      </w:pPr>
-      <w:r>
-        <w:t>consent-worker/worker.js — Cloudflare Worker</w:t>
-      </w:r>
-    </w:p>
-    <w:p>
-      <w:pPr>
-        <w:pStyle w:val="ListBullet"/>
-      </w:pPr>
-      <w:r>
-        <w:t>consent-worker/wrangler.toml — Worker configuration</w:t>
-      </w:r>
-    </w:p>
-    <w:p>
-      <w:pPr>
-        <w:pStyle w:val="ListBullet"/>
-      </w:pPr>
-      <w:r>
-        <w:t>robots.txt — Search engine directives</w:t>
-      </w:r>
-    </w:p>
-    <w:p>
-      <w:pPr>
-        <w:pStyle w:val="ListBullet"/>
-      </w:pPr>
-      <w:r>
-        <w:t>sitemap.xml — Sitemap with 18 URLs</w:t>
-      </w:r>
-    </w:p>
-    <w:p>
-      <w:pPr>
-        <w:pStyle w:val="Heading2"/>
-      </w:pPr>
-      <w:r>
-        <w:t>Modified Files (12)</w:t>
-      </w:r>
-    </w:p>
-    <w:p>
-      <w:pPr>
-        <w:pStyle w:val="ListBullet"/>
-      </w:pPr>
-      <w:r>
-        <w:t>main.html + EL/main.html — All compliance changes (CMP, footer, claims text, video, security headers, stats)</w:t>
-      </w:r>
-    </w:p>
-    <w:p>
-      <w:pPr>
-        <w:pStyle w:val="ListBullet"/>
-      </w:pPr>
-      <w:r>
-        <w:t>motor.html + EL/motor.html — CMP, footer, claims text, alt text, security headers</w:t>
-      </w:r>
-    </w:p>
-    <w:p>
-      <w:pPr>
-        <w:pStyle w:val="ListBullet"/>
-      </w:pPr>
-      <w:r>
-        <w:t>health.html + EL/health.html — CMP, footer, claims text, alt text, security headers</w:t>
-      </w:r>
-    </w:p>
-    <w:p>
-      <w:pPr>
-        <w:pStyle w:val="ListBullet"/>
-      </w:pPr>
-      <w:r>
-        <w:t>home.html + EL/home.html — CMP, footer, claims text, alt text, security headers</w:t>
-      </w:r>
-    </w:p>
-    <w:p>
-      <w:pPr>
-        <w:pStyle w:val="ListBullet"/>
-      </w:pPr>
-      <w:r>
-        <w:t>business.html + EL/business.html — CMP, footer, claims text, alt text, security headers</w:t>
-      </w:r>
-    </w:p>
-    <w:p>
-      <w:pPr>
-        <w:pStyle w:val="ListBullet"/>
-      </w:pPr>
-      <w:r>
-        <w:t>assets/css/main.css — CMP styles, legal page styles, reduced motion</w:t>
-      </w:r>
-    </w:p>
-    <w:p>
-      <w:pPr>
-        <w:pStyle w:val="ListBullet"/>
-      </w:pPr>
-      <w:r>
-        <w:t>assets/css/sub.css — CMP styles, legal page styles, reduced motion, cookie code color fix</w:t>
-      </w:r>
-    </w:p>
-    <w:p>
-      <w:pPr>
-        <w:pStyle w:val="ListBullet"/>
-      </w:pPr>
-      <w:r>
-        <w:t>assets/vendor/php-email-form/validate.js — XSS fix (innerHTML → textContent)</w:t>
-      </w:r>
-    </w:p>
+    <w:tbl>
+      <w:tblPr>
+        <w:tblStyle w:val="TableGrid"/>
+        <w:tblW w:type="auto" w:w="0"/>
+        <w:tblLook w:firstColumn="1" w:firstRow="1" w:lastColumn="0" w:lastRow="0" w:noHBand="0" w:noVBand="1" w:val="04A0"/>
+      </w:tblPr>
+      <w:tblGrid>
+        <w:gridCol w:w="2880"/>
+        <w:gridCol w:w="2880"/>
+        <w:gridCol w:w="2880"/>
+      </w:tblGrid>
+      <w:tr>
+        <w:tc>
+          <w:tcPr>
+            <w:tcW w:type="dxa" w:w="2880"/>
+          </w:tcPr>
+          <w:p>
+            <w:r>
+              <w:rPr>
+                <w:b/>
+              </w:rPr>
+              <w:t>#</w:t>
+            </w:r>
+          </w:p>
+        </w:tc>
+        <w:tc>
+          <w:tcPr>
+            <w:tcW w:type="dxa" w:w="2880"/>
+          </w:tcPr>
+          <w:p>
+            <w:r>
+              <w:rPr>
+                <w:b/>
+              </w:rPr>
+              <w:t>Task</w:t>
+            </w:r>
+          </w:p>
+        </w:tc>
+        <w:tc>
+          <w:tcPr>
+            <w:tcW w:type="dxa" w:w="2880"/>
+          </w:tcPr>
+          <w:p>
+            <w:r>
+              <w:rPr>
+                <w:b/>
+              </w:rPr>
+              <w:t>Status</w:t>
+            </w:r>
+          </w:p>
+        </w:tc>
+      </w:tr>
+      <w:tr>
+        <w:tc>
+          <w:tcPr>
+            <w:tcW w:type="dxa" w:w="2880"/>
+          </w:tcPr>
+          <w:p>
+            <w:r>
+              <w:t>1</w:t>
+            </w:r>
+          </w:p>
+        </w:tc>
+        <w:tc>
+          <w:tcPr>
+            <w:tcW w:type="dxa" w:w="2880"/>
+          </w:tcPr>
+          <w:p>
+            <w:r>
+              <w:t>Fill in 3 disclosures placeholders (licence, registration, advice)</w:t>
+            </w:r>
+          </w:p>
+        </w:tc>
+        <w:tc>
+          <w:tcPr>
+            <w:tcW w:type="dxa" w:w="2880"/>
+          </w:tcPr>
+          <w:p>
+            <w:r>
+              <w:t>Waiting on CEO</w:t>
+            </w:r>
+          </w:p>
+        </w:tc>
+      </w:tr>
+      <w:tr>
+        <w:tc>
+          <w:tcPr>
+            <w:tcW w:type="dxa" w:w="2880"/>
+          </w:tcPr>
+          <w:p>
+            <w:r>
+              <w:t>2</w:t>
+            </w:r>
+          </w:p>
+        </w:tc>
+        <w:tc>
+          <w:tcPr>
+            <w:tcW w:type="dxa" w:w="2880"/>
+          </w:tcPr>
+          <w:p>
+            <w:r>
+              <w:t>Update CORS in consent worker from * to production domain</w:t>
+            </w:r>
+          </w:p>
+        </w:tc>
+        <w:tc>
+          <w:tcPr>
+            <w:tcW w:type="dxa" w:w="2880"/>
+          </w:tcPr>
+          <w:p>
+            <w:r>
+              <w:t>Waiting on domain</w:t>
+            </w:r>
+          </w:p>
+        </w:tc>
+      </w:tr>
+      <w:tr>
+        <w:tc>
+          <w:tcPr>
+            <w:tcW w:type="dxa" w:w="2880"/>
+          </w:tcPr>
+          <w:p>
+            <w:r>
+              <w:t>3</w:t>
+            </w:r>
+          </w:p>
+        </w:tc>
+        <w:tc>
+          <w:tcPr>
+            <w:tcW w:type="dxa" w:w="2880"/>
+          </w:tcPr>
+          <w:p>
+            <w:r>
+              <w:t>Update sitemap.xml URLs from eacinsurance.com to actual domain</w:t>
+            </w:r>
+          </w:p>
+        </w:tc>
+        <w:tc>
+          <w:tcPr>
+            <w:tcW w:type="dxa" w:w="2880"/>
+          </w:tcPr>
+          <w:p>
+            <w:r>
+              <w:t>Waiting on domain</w:t>
+            </w:r>
+          </w:p>
+        </w:tc>
+      </w:tr>
+      <w:tr>
+        <w:tc>
+          <w:tcPr>
+            <w:tcW w:type="dxa" w:w="2880"/>
+          </w:tcPr>
+          <w:p>
+            <w:r>
+              <w:t>4</w:t>
+            </w:r>
+          </w:p>
+        </w:tc>
+        <w:tc>
+          <w:tcPr>
+            <w:tcW w:type="dxa" w:w="2880"/>
+          </w:tcPr>
+          <w:p>
+            <w:r>
+              <w:t>Update robots.txt Sitemap URL to actual domain</w:t>
+            </w:r>
+          </w:p>
+        </w:tc>
+        <w:tc>
+          <w:tcPr>
+            <w:tcW w:type="dxa" w:w="2880"/>
+          </w:tcPr>
+          <w:p>
+            <w:r>
+              <w:t>Waiting on domain</w:t>
+            </w:r>
+          </w:p>
+        </w:tc>
+      </w:tr>
+      <w:tr>
+        <w:tc>
+          <w:tcPr>
+            <w:tcW w:type="dxa" w:w="2880"/>
+          </w:tcPr>
+          <w:p>
+            <w:r>
+              <w:t>5</w:t>
+            </w:r>
+          </w:p>
+        </w:tc>
+        <w:tc>
+          <w:tcPr>
+            <w:tcW w:type="dxa" w:w="2880"/>
+          </w:tcPr>
+          <w:p>
+            <w:r>
+              <w:t>Redeploy Cloudflare Worker: npx wrangler deploy</w:t>
+            </w:r>
+          </w:p>
+        </w:tc>
+        <w:tc>
+          <w:tcPr>
+            <w:tcW w:type="dxa" w:w="2880"/>
+          </w:tcPr>
+          <w:p>
+            <w:r>
+              <w:t>After CORS update</w:t>
+            </w:r>
+          </w:p>
+        </w:tc>
+      </w:tr>
+      <w:tr>
+        <w:tc>
+          <w:tcPr>
+            <w:tcW w:type="dxa" w:w="2880"/>
+          </w:tcPr>
+          <w:p>
+            <w:r>
+              <w:t>6</w:t>
+            </w:r>
+          </w:p>
+        </w:tc>
+        <w:tc>
+          <w:tcPr>
+            <w:tcW w:type="dxa" w:w="2880"/>
+          </w:tcPr>
+          <w:p>
+            <w:r>
+              <w:t>Submit sitemap to Google Search Console</w:t>
+            </w:r>
+          </w:p>
+        </w:tc>
+        <w:tc>
+          <w:tcPr>
+            <w:tcW w:type="dxa" w:w="2880"/>
+          </w:tcPr>
+          <w:p>
+            <w:r>
+              <w:t>After deployment</w:t>
+            </w:r>
+          </w:p>
+        </w:tc>
+      </w:tr>
+      <w:tr>
+        <w:tc>
+          <w:tcPr>
+            <w:tcW w:type="dxa" w:w="2880"/>
+          </w:tcPr>
+          <w:p>
+            <w:r>
+              <w:t>7</w:t>
+            </w:r>
+          </w:p>
+        </w:tc>
+        <w:tc>
+          <w:tcPr>
+            <w:tcW w:type="dxa" w:w="2880"/>
+          </w:tcPr>
+          <w:p>
+            <w:r>
+              <w:t>Run Lighthouse audit for final performance check</w:t>
+            </w:r>
+          </w:p>
+        </w:tc>
+        <w:tc>
+          <w:tcPr>
+            <w:tcW w:type="dxa" w:w="2880"/>
+          </w:tcPr>
+          <w:p>
+            <w:r>
+              <w:t>After deployment</w:t>
+            </w:r>
+          </w:p>
+        </w:tc>
+      </w:tr>
+    </w:tbl>
     <w:sectPr>
       <w:pgSz w:w="12240" w:h="15840"/>
       <w:pgMar w:top="1440" w:right="1800" w:bottom="1440" w:left="1800" w:header="720" w:footer="720" w:gutter="0"/>

</xml_diff>

<commit_message>
Add domain name requirement to compliance report (Section 5.2)
</commit_message>
<xml_diff>
--- a/EAC_Compliance_Report.docx
+++ b/EAC_Compliance_Report.docx
@@ -2176,7 +2176,104 @@
         <w:pStyle w:val="Heading2"/>
       </w:pPr>
       <w:r>
-        <w:t>5.2 WhatsApp Business Chatbot</w:t>
+        <w:t>5.2 Domain Name</w:t>
+      </w:r>
+    </w:p>
+    <w:p>
+      <w:r>
+        <w:t>Andros needs to decide on the website domain name. This is required before we can:</w:t>
+      </w:r>
+    </w:p>
+    <w:p>
+      <w:pPr>
+        <w:pStyle w:val="ListBullet"/>
+      </w:pPr>
+      <w:r>
+        <w:t>Configure hosting and deploy the website</w:t>
+      </w:r>
+    </w:p>
+    <w:p>
+      <w:pPr>
+        <w:pStyle w:val="ListBullet"/>
+      </w:pPr>
+      <w:r>
+        <w:t>Update the sitemap.xml and robots.txt with the correct domain</w:t>
+      </w:r>
+    </w:p>
+    <w:p>
+      <w:pPr>
+        <w:pStyle w:val="ListBullet"/>
+      </w:pPr>
+      <w:r>
+        <w:t>Update the CORS policy on the Cloudflare consent logging worker to only accept requests from the production domain</w:t>
+      </w:r>
+    </w:p>
+    <w:p>
+      <w:pPr>
+        <w:pStyle w:val="ListBullet"/>
+      </w:pPr>
+      <w:r>
+        <w:t>Set up SSL certificate (HTTPS)</w:t>
+      </w:r>
+    </w:p>
+    <w:p>
+      <w:pPr>
+        <w:pStyle w:val="ListBullet"/>
+      </w:pPr>
+      <w:r>
+        <w:t>Submit the site to Google Search Console</w:t>
+      </w:r>
+    </w:p>
+    <w:p/>
+    <w:p>
+      <w:r>
+        <w:t>Suggested domain options for Andros to consider:</w:t>
+      </w:r>
+    </w:p>
+    <w:p>
+      <w:pPr>
+        <w:pStyle w:val="ListBullet"/>
+      </w:pPr>
+      <w:r>
+        <w:t>eacinsurance.com — Clean, professional, matches the brand</w:t>
+      </w:r>
+    </w:p>
+    <w:p>
+      <w:pPr>
+        <w:pStyle w:val="ListBullet"/>
+      </w:pPr>
+      <w:r>
+        <w:t>eacinsurance.cy — Cyprus country domain, signals local presence</w:t>
+      </w:r>
+    </w:p>
+    <w:p>
+      <w:pPr>
+        <w:pStyle w:val="ListBullet"/>
+      </w:pPr>
+      <w:r>
+        <w:t>eac-insurance.com — With hyphen, if eacinsurance.com is taken</w:t>
+      </w:r>
+    </w:p>
+    <w:p>
+      <w:pPr>
+        <w:pStyle w:val="ListBullet"/>
+      </w:pPr>
+      <w:r>
+        <w:t>eacinsurances.com — Plural, matching the email (e.a.c.insurances@outlook.com)</w:t>
+      </w:r>
+    </w:p>
+    <w:p/>
+    <w:p>
+      <w:r>
+        <w:t>Andros should check availability and register the chosen domain. We recommend registering both .com and .cy if available.</w:t>
+      </w:r>
+    </w:p>
+    <w:p>
+      <w:pPr>
+        <w:pStyle w:val="Heading2"/>
+      </w:pPr>
+      <w:r>
+        <w:t>5.3 WhatsApp Business Chatbot</w:t>
       </w:r>
     </w:p>
     <w:p>

</xml_diff>